<commit_message>
Remove checklist from NeurIPS Word doc (separate file)
Co-Authored-By: Claude Opus 4.6 (1M context) <noreply@anthropic.com>
</commit_message>
<xml_diff>
--- a/article/article_v4_neurips.docx
+++ b/article/article_v4_neurips.docx
@@ -8150,1433 +8150,6 @@
     </w:p>
     <w:bookmarkEnd w:id="33"/>
     <w:bookmarkStart w:id="34" w:name="neurips-paper-checklist"/>
-    <w:p>
-      <w:pPr>
-        <w:pStyle w:val="Heading2"/>
-        <w:keepNext/>
-        <w:keepLines/>
-        <w:widowControl w:val="1"/>
-      </w:pPr>
-      <w:r>
-        <w:t xml:space="preserve">NeurIPS Paper Checklist</w:t>
-      </w:r>
-    </w:p>
-    <w:p>
-      <w:pPr>
-        <w:pStyle w:val="FirstParagraph"/>
-        <w:jc w:val="both"/>
-        <w:keepNext w:val="0"/>
-        <w:keepLines w:val="0"/>
-        <w:widowControl w:val="1"/>
-      </w:pPr>
-      <w:r>
-        <w:t xml:space="preserve">The following checklist is required for all NeurIPS submissions. Answers are provided with justifications relevant to this paper.</w:t>
-      </w:r>
-    </w:p>
-    <w:p>
-      <w:pPr>
-        <w:pStyle w:val="BodyText"/>
-        <w:jc w:val="both"/>
-        <w:keepNext w:val="0"/>
-        <w:keepLines w:val="0"/>
-        <w:widowControl w:val="1"/>
-      </w:pPr>
-      <w:r>
-        <w:t xml:space="preserve">1. Claims</w:t>
-      </w:r>
-    </w:p>
-    <w:p>
-      <w:pPr>
-        <w:pStyle w:val="BodyText"/>
-        <w:jc w:val="both"/>
-        <w:keepNext w:val="0"/>
-        <w:keepLines w:val="0"/>
-        <w:widowControl w:val="1"/>
-      </w:pPr>
-      <w:r>
-        <w:rPr>
-          <w:i/>
-          <w:iCs/>
-        </w:rPr>
-        <w:t xml:space="preserve">Question:</w:t>
-      </w:r>
-      <w:r>
-        <w:t xml:space="preserve"> </w:t>
-      </w:r>
-      <w:r>
-        <w:t xml:space="preserve">Do the main claims made in the abstract and introduction accurately reflect the paper's contributions and scope?</w:t>
-      </w:r>
-    </w:p>
-    <w:p>
-      <w:pPr>
-        <w:pStyle w:val="BodyText"/>
-        <w:jc w:val="both"/>
-        <w:keepNext w:val="0"/>
-        <w:keepLines w:val="0"/>
-        <w:widowControl w:val="1"/>
-      </w:pPr>
-      <w:r>
-        <w:rPr>
-          <w:b/>
-          <w:bCs/>
-        </w:rPr>
-        <w:t xml:space="preserve">Answer:</w:t>
-      </w:r>
-      <w:r>
-        <w:t xml:space="preserve"> </w:t>
-      </w:r>
-      <w:r>
-        <w:t xml:space="preserve">Yes.</w:t>
-      </w:r>
-    </w:p>
-    <w:p>
-      <w:pPr>
-        <w:pStyle w:val="BodyText"/>
-        <w:jc w:val="both"/>
-        <w:keepNext w:val="0"/>
-        <w:keepLines w:val="0"/>
-        <w:widowControl w:val="1"/>
-      </w:pPr>
-      <w:r>
-        <w:rPr>
-          <w:b/>
-          <w:bCs/>
-        </w:rPr>
-        <w:t xml:space="preserve">Justification:</w:t>
-      </w:r>
-      <w:r>
-        <w:t xml:space="preserve"> </w:t>
-      </w:r>
-      <w:r>
-        <w:t xml:space="preserve">All claims (dataset size, non-locality property, 19 configurations, specific performance numbers) are supported by the experimental results in Section 5. Limitations are discussed in Section 6.</w:t>
-      </w:r>
-    </w:p>
-    <w:p>
-      <w:pPr>
-        <w:pStyle w:val="BodyText"/>
-        <w:jc w:val="both"/>
-        <w:keepNext w:val="0"/>
-        <w:keepLines w:val="0"/>
-        <w:widowControl w:val="1"/>
-      </w:pPr>
-      <w:r>
-        <w:t xml:space="preserve">2. Limitations</w:t>
-      </w:r>
-    </w:p>
-    <w:p>
-      <w:pPr>
-        <w:pStyle w:val="BodyText"/>
-        <w:jc w:val="both"/>
-        <w:keepNext w:val="0"/>
-        <w:keepLines w:val="0"/>
-        <w:widowControl w:val="1"/>
-      </w:pPr>
-      <w:r>
-        <w:rPr>
-          <w:i/>
-          <w:iCs/>
-        </w:rPr>
-        <w:t xml:space="preserve">Question:</w:t>
-      </w:r>
-      <w:r>
-        <w:t xml:space="preserve"> </w:t>
-      </w:r>
-      <w:r>
-        <w:t xml:space="preserve">Does the paper discuss the limitations of the work performed by the authors?</w:t>
-      </w:r>
-    </w:p>
-    <w:p>
-      <w:pPr>
-        <w:pStyle w:val="BodyText"/>
-        <w:jc w:val="both"/>
-        <w:keepNext w:val="0"/>
-        <w:keepLines w:val="0"/>
-        <w:widowControl w:val="1"/>
-      </w:pPr>
-      <w:r>
-        <w:rPr>
-          <w:b/>
-          <w:bCs/>
-        </w:rPr>
-        <w:t xml:space="preserve">Answer:</w:t>
-      </w:r>
-      <w:r>
-        <w:t xml:space="preserve"> </w:t>
-      </w:r>
-      <w:r>
-        <w:t xml:space="preserve">Yes.</w:t>
-      </w:r>
-    </w:p>
-    <w:p>
-      <w:pPr>
-        <w:pStyle w:val="BodyText"/>
-        <w:jc w:val="both"/>
-        <w:keepNext w:val="0"/>
-        <w:keepLines w:val="0"/>
-        <w:widowControl w:val="1"/>
-      </w:pPr>
-      <w:r>
-        <w:rPr>
-          <w:b/>
-          <w:bCs/>
-        </w:rPr>
-        <w:t xml:space="preserve">Justification:</w:t>
-      </w:r>
-      <w:r>
-        <w:t xml:space="preserve"> </w:t>
-      </w:r>
-      <w:r>
-        <w:t xml:space="preserve">Section 6 discusses limitations including English-only scope, LLM-generated elision, alias-aware evaluation gaps, and QLoRA sequence length truncation.</w:t>
-      </w:r>
-    </w:p>
-    <w:p>
-      <w:pPr>
-        <w:pStyle w:val="BodyText"/>
-        <w:jc w:val="both"/>
-        <w:keepNext w:val="0"/>
-        <w:keepLines w:val="0"/>
-        <w:widowControl w:val="1"/>
-      </w:pPr>
-      <w:r>
-        <w:t xml:space="preserve">3. Theory Assumptions and Proofs</w:t>
-      </w:r>
-    </w:p>
-    <w:p>
-      <w:pPr>
-        <w:pStyle w:val="BodyText"/>
-        <w:jc w:val="both"/>
-        <w:keepNext w:val="0"/>
-        <w:keepLines w:val="0"/>
-        <w:widowControl w:val="1"/>
-      </w:pPr>
-      <w:r>
-        <w:rPr>
-          <w:i/>
-          <w:iCs/>
-        </w:rPr>
-        <w:t xml:space="preserve">Question:</w:t>
-      </w:r>
-      <w:r>
-        <w:t xml:space="preserve"> </w:t>
-      </w:r>
-      <w:r>
-        <w:t xml:space="preserve">For each theoretical result, does the paper provide the full set of assumptions and a complete (or correct) proof?</w:t>
-      </w:r>
-    </w:p>
-    <w:p>
-      <w:pPr>
-        <w:pStyle w:val="BodyText"/>
-        <w:jc w:val="both"/>
-        <w:keepNext w:val="0"/>
-        <w:keepLines w:val="0"/>
-        <w:widowControl w:val="1"/>
-      </w:pPr>
-      <w:r>
-        <w:rPr>
-          <w:b/>
-          <w:bCs/>
-        </w:rPr>
-        <w:t xml:space="preserve">Answer:</w:t>
-      </w:r>
-      <w:r>
-        <w:t xml:space="preserve"> </w:t>
-      </w:r>
-      <w:r>
-        <w:t xml:space="preserve">NA.</w:t>
-      </w:r>
-    </w:p>
-    <w:p>
-      <w:pPr>
-        <w:pStyle w:val="BodyText"/>
-        <w:jc w:val="both"/>
-        <w:keepNext w:val="0"/>
-        <w:keepLines w:val="0"/>
-        <w:widowControl w:val="1"/>
-      </w:pPr>
-      <w:r>
-        <w:rPr>
-          <w:b/>
-          <w:bCs/>
-        </w:rPr>
-        <w:t xml:space="preserve">Justification:</w:t>
-      </w:r>
-      <w:r>
-        <w:t xml:space="preserve"> </w:t>
-      </w:r>
-      <w:r>
-        <w:t xml:space="preserve">The paper does not include formal theorems. The non-locality property (Section 4.2) is defined formally and validated empirically rather than proved theoretically.</w:t>
-      </w:r>
-    </w:p>
-    <w:p>
-      <w:pPr>
-        <w:pStyle w:val="BodyText"/>
-        <w:jc w:val="both"/>
-        <w:keepNext w:val="0"/>
-        <w:keepLines w:val="0"/>
-        <w:widowControl w:val="1"/>
-      </w:pPr>
-      <w:r>
-        <w:t xml:space="preserve">4. Experimental Result Reproducibility</w:t>
-      </w:r>
-    </w:p>
-    <w:p>
-      <w:pPr>
-        <w:pStyle w:val="BodyText"/>
-        <w:jc w:val="both"/>
-        <w:keepNext w:val="0"/>
-        <w:keepLines w:val="0"/>
-        <w:widowControl w:val="1"/>
-      </w:pPr>
-      <w:r>
-        <w:rPr>
-          <w:i/>
-          <w:iCs/>
-        </w:rPr>
-        <w:t xml:space="preserve">Question:</w:t>
-      </w:r>
-      <w:r>
-        <w:t xml:space="preserve"> </w:t>
-      </w:r>
-      <w:r>
-        <w:t xml:space="preserve">Does the paper fully disclose all the information needed to reproduce the main experimental results of the paper to the extent that it affects the main claims and/or conclusions of the paper?</w:t>
-      </w:r>
-    </w:p>
-    <w:p>
-      <w:pPr>
-        <w:pStyle w:val="BodyText"/>
-        <w:jc w:val="both"/>
-        <w:keepNext w:val="0"/>
-        <w:keepLines w:val="0"/>
-        <w:widowControl w:val="1"/>
-      </w:pPr>
-      <w:r>
-        <w:rPr>
-          <w:b/>
-          <w:bCs/>
-        </w:rPr>
-        <w:t xml:space="preserve">Answer:</w:t>
-      </w:r>
-      <w:r>
-        <w:t xml:space="preserve"> </w:t>
-      </w:r>
-      <w:r>
-        <w:t xml:space="preserve">Yes.</w:t>
-      </w:r>
-    </w:p>
-    <w:p>
-      <w:pPr>
-        <w:pStyle w:val="BodyText"/>
-        <w:jc w:val="both"/>
-        <w:keepNext w:val="0"/>
-        <w:keepLines w:val="0"/>
-        <w:widowControl w:val="1"/>
-      </w:pPr>
-      <w:r>
-        <w:rPr>
-          <w:b/>
-          <w:bCs/>
-        </w:rPr>
-        <w:t xml:space="preserve">Justification:</w:t>
-      </w:r>
-      <w:r>
-        <w:t xml:space="preserve"> </w:t>
-      </w:r>
-      <w:r>
-        <w:t xml:space="preserve">All model names, hyperparameters (Section 4.3, 4.4), evaluation metrics (Section 4.6), data splits (Table 2), and prompt templates are fully specified. Code and data will be publicly released.</w:t>
-      </w:r>
-    </w:p>
-    <w:p>
-      <w:pPr>
-        <w:pStyle w:val="BodyText"/>
-        <w:jc w:val="both"/>
-        <w:keepNext w:val="0"/>
-        <w:keepLines w:val="0"/>
-        <w:widowControl w:val="1"/>
-      </w:pPr>
-      <w:r>
-        <w:t xml:space="preserve">5. Open Access to Data and Code</w:t>
-      </w:r>
-    </w:p>
-    <w:p>
-      <w:pPr>
-        <w:pStyle w:val="BodyText"/>
-        <w:jc w:val="both"/>
-        <w:keepNext w:val="0"/>
-        <w:keepLines w:val="0"/>
-        <w:widowControl w:val="1"/>
-      </w:pPr>
-      <w:r>
-        <w:rPr>
-          <w:i/>
-          <w:iCs/>
-        </w:rPr>
-        <w:t xml:space="preserve">Question:</w:t>
-      </w:r>
-      <w:r>
-        <w:t xml:space="preserve"> </w:t>
-      </w:r>
-      <w:r>
-        <w:t xml:space="preserve">Does the paper provide open access to the data and code, with sufficient instructions to faithfully reproduce the main experimental results?</w:t>
-      </w:r>
-    </w:p>
-    <w:p>
-      <w:pPr>
-        <w:pStyle w:val="BodyText"/>
-        <w:jc w:val="both"/>
-        <w:keepNext w:val="0"/>
-        <w:keepLines w:val="0"/>
-        <w:widowControl w:val="1"/>
-      </w:pPr>
-      <w:r>
-        <w:rPr>
-          <w:b/>
-          <w:bCs/>
-        </w:rPr>
-        <w:t xml:space="preserve">Answer:</w:t>
-      </w:r>
-      <w:r>
-        <w:t xml:space="preserve"> </w:t>
-      </w:r>
-      <w:r>
-        <w:t xml:space="preserve">Yes.</w:t>
-      </w:r>
-    </w:p>
-    <w:p>
-      <w:pPr>
-        <w:pStyle w:val="BodyText"/>
-        <w:jc w:val="both"/>
-        <w:keepNext w:val="0"/>
-        <w:keepLines w:val="0"/>
-        <w:widowControl w:val="1"/>
-      </w:pPr>
-      <w:r>
-        <w:rPr>
-          <w:b/>
-          <w:bCs/>
-        </w:rPr>
-        <w:t xml:space="preserve">Justification:</w:t>
-      </w:r>
-      <w:r>
-        <w:t xml:space="preserve"> </w:t>
-      </w:r>
-      <w:r>
-        <w:t xml:space="preserve">All data, code, and evaluation tools are publicly released under an open license.</w:t>
-      </w:r>
-    </w:p>
-    <w:p>
-      <w:pPr>
-        <w:pStyle w:val="BodyText"/>
-        <w:jc w:val="both"/>
-        <w:keepNext w:val="0"/>
-        <w:keepLines w:val="0"/>
-        <w:widowControl w:val="1"/>
-      </w:pPr>
-      <w:r>
-        <w:t xml:space="preserve">6. Experimental Setting/Details</w:t>
-      </w:r>
-    </w:p>
-    <w:p>
-      <w:pPr>
-        <w:pStyle w:val="BodyText"/>
-        <w:jc w:val="both"/>
-        <w:keepNext w:val="0"/>
-        <w:keepLines w:val="0"/>
-        <w:widowControl w:val="1"/>
-      </w:pPr>
-      <w:r>
-        <w:rPr>
-          <w:i/>
-          <w:iCs/>
-        </w:rPr>
-        <w:t xml:space="preserve">Question:</w:t>
-      </w:r>
-      <w:r>
-        <w:t xml:space="preserve"> </w:t>
-      </w:r>
-      <w:r>
-        <w:t xml:space="preserve">Does the paper specify all the training and test details necessary to understand the results?</w:t>
-      </w:r>
-    </w:p>
-    <w:p>
-      <w:pPr>
-        <w:pStyle w:val="BodyText"/>
-        <w:jc w:val="both"/>
-        <w:keepNext w:val="0"/>
-        <w:keepLines w:val="0"/>
-        <w:widowControl w:val="1"/>
-      </w:pPr>
-      <w:r>
-        <w:rPr>
-          <w:b/>
-          <w:bCs/>
-        </w:rPr>
-        <w:t xml:space="preserve">Answer:</w:t>
-      </w:r>
-      <w:r>
-        <w:t xml:space="preserve"> </w:t>
-      </w:r>
-      <w:r>
-        <w:t xml:space="preserve">Yes.</w:t>
-      </w:r>
-    </w:p>
-    <w:p>
-      <w:pPr>
-        <w:pStyle w:val="BodyText"/>
-        <w:jc w:val="both"/>
-        <w:keepNext w:val="0"/>
-        <w:keepLines w:val="0"/>
-        <w:widowControl w:val="1"/>
-      </w:pPr>
-      <w:r>
-        <w:rPr>
-          <w:b/>
-          <w:bCs/>
-        </w:rPr>
-        <w:t xml:space="preserve">Justification:</w:t>
-      </w:r>
-      <w:r>
-        <w:t xml:space="preserve"> </w:t>
-      </w:r>
-      <w:r>
-        <w:t xml:space="preserve">Training details (QLoRA: 4-bit NF4, rank 16, alpha 32, 2 epochs; DPR: 3 epochs, batch 48, lr 2e-5), evaluation protocol (four-tier matching), and statistical tests (McNemar's) are fully specified.</w:t>
-      </w:r>
-    </w:p>
-    <w:p>
-      <w:pPr>
-        <w:pStyle w:val="BodyText"/>
-        <w:jc w:val="both"/>
-        <w:keepNext w:val="0"/>
-        <w:keepLines w:val="0"/>
-        <w:widowControl w:val="1"/>
-      </w:pPr>
-      <w:r>
-        <w:t xml:space="preserve">7. Experiment Statistical Significance</w:t>
-      </w:r>
-    </w:p>
-    <w:p>
-      <w:pPr>
-        <w:pStyle w:val="BodyText"/>
-        <w:jc w:val="both"/>
-        <w:keepNext w:val="0"/>
-        <w:keepLines w:val="0"/>
-        <w:widowControl w:val="1"/>
-      </w:pPr>
-      <w:r>
-        <w:rPr>
-          <w:i/>
-          <w:iCs/>
-        </w:rPr>
-        <w:t xml:space="preserve">Question:</w:t>
-      </w:r>
-      <w:r>
-        <w:t xml:space="preserve"> </w:t>
-      </w:r>
-      <w:r>
-        <w:t xml:space="preserve">Does the paper report error bars, confidence intervals, or statistical significance tests?</w:t>
-      </w:r>
-    </w:p>
-    <w:p>
-      <w:pPr>
-        <w:pStyle w:val="BodyText"/>
-        <w:jc w:val="both"/>
-        <w:keepNext w:val="0"/>
-        <w:keepLines w:val="0"/>
-        <w:widowControl w:val="1"/>
-      </w:pPr>
-      <w:r>
-        <w:rPr>
-          <w:b/>
-          <w:bCs/>
-        </w:rPr>
-        <w:t xml:space="preserve">Answer:</w:t>
-      </w:r>
-      <w:r>
-        <w:t xml:space="preserve"> </w:t>
-      </w:r>
-      <w:r>
-        <w:t xml:space="preserve">Yes.</w:t>
-      </w:r>
-    </w:p>
-    <w:p>
-      <w:pPr>
-        <w:pStyle w:val="BodyText"/>
-        <w:jc w:val="both"/>
-        <w:keepNext w:val="0"/>
-        <w:keepLines w:val="0"/>
-        <w:widowControl w:val="1"/>
-      </w:pPr>
-      <w:r>
-        <w:rPr>
-          <w:b/>
-          <w:bCs/>
-        </w:rPr>
-        <w:t xml:space="preserve">Justification:</w:t>
-      </w:r>
-      <w:r>
-        <w:t xml:space="preserve"> </w:t>
-      </w:r>
-      <w:r>
-        <w:t xml:space="preserve">All key comparisons use McNemar's test with continuity correction (p &lt; 0.001). Bootstrap confidence intervals (1,000 resamples) are computed for main results.</w:t>
-      </w:r>
-    </w:p>
-    <w:p>
-      <w:pPr>
-        <w:pStyle w:val="BodyText"/>
-        <w:jc w:val="both"/>
-        <w:keepNext w:val="0"/>
-        <w:keepLines w:val="0"/>
-        <w:widowControl w:val="1"/>
-      </w:pPr>
-      <w:r>
-        <w:t xml:space="preserve">8. Experiments Compute Resources</w:t>
-      </w:r>
-    </w:p>
-    <w:p>
-      <w:pPr>
-        <w:pStyle w:val="BodyText"/>
-        <w:jc w:val="both"/>
-        <w:keepNext w:val="0"/>
-        <w:keepLines w:val="0"/>
-        <w:widowControl w:val="1"/>
-      </w:pPr>
-      <w:r>
-        <w:rPr>
-          <w:i/>
-          <w:iCs/>
-        </w:rPr>
-        <w:t xml:space="preserve">Question:</w:t>
-      </w:r>
-      <w:r>
-        <w:t xml:space="preserve"> </w:t>
-      </w:r>
-      <w:r>
-        <w:t xml:space="preserve">For each experiment, does the paper provide sufficient information on the computer resources needed to reproduce them?</w:t>
-      </w:r>
-    </w:p>
-    <w:p>
-      <w:pPr>
-        <w:pStyle w:val="BodyText"/>
-        <w:jc w:val="both"/>
-        <w:keepNext w:val="0"/>
-        <w:keepLines w:val="0"/>
-        <w:widowControl w:val="1"/>
-      </w:pPr>
-      <w:r>
-        <w:rPr>
-          <w:b/>
-          <w:bCs/>
-        </w:rPr>
-        <w:t xml:space="preserve">Answer:</w:t>
-      </w:r>
-      <w:r>
-        <w:t xml:space="preserve"> </w:t>
-      </w:r>
-      <w:r>
-        <w:t xml:space="preserve">Yes.</w:t>
-      </w:r>
-    </w:p>
-    <w:p>
-      <w:pPr>
-        <w:pStyle w:val="BodyText"/>
-        <w:jc w:val="both"/>
-        <w:keepNext w:val="0"/>
-        <w:keepLines w:val="0"/>
-        <w:widowControl w:val="1"/>
-      </w:pPr>
-      <w:r>
-        <w:rPr>
-          <w:b/>
-          <w:bCs/>
-        </w:rPr>
-        <w:t xml:space="preserve">Justification:</w:t>
-      </w:r>
-      <w:r>
-        <w:t xml:space="preserve"> </w:t>
-      </w:r>
-      <w:r>
-        <w:t xml:space="preserve">QLoRA fine-tuning was performed on a single NVIDIA RTX GPU with 6GB VRAM. DPR training used similar consumer-grade hardware. API-based models (GPT-4o, GPT-4.1-mini) were accessed via OpenAI Batch API.</w:t>
-      </w:r>
-    </w:p>
-    <w:p>
-      <w:pPr>
-        <w:pStyle w:val="BodyText"/>
-        <w:jc w:val="both"/>
-        <w:keepNext w:val="0"/>
-        <w:keepLines w:val="0"/>
-        <w:widowControl w:val="1"/>
-      </w:pPr>
-      <w:r>
-        <w:t xml:space="preserve">9. NeurIPS Code of Ethics</w:t>
-      </w:r>
-    </w:p>
-    <w:p>
-      <w:pPr>
-        <w:pStyle w:val="BodyText"/>
-        <w:jc w:val="both"/>
-        <w:keepNext w:val="0"/>
-        <w:keepLines w:val="0"/>
-        <w:widowControl w:val="1"/>
-      </w:pPr>
-      <w:r>
-        <w:rPr>
-          <w:i/>
-          <w:iCs/>
-        </w:rPr>
-        <w:t xml:space="preserve">Question:</w:t>
-      </w:r>
-      <w:r>
-        <w:t xml:space="preserve"> </w:t>
-      </w:r>
-      <w:r>
-        <w:t xml:space="preserve">Does the research conform to the NeurIPS Code of Ethics?</w:t>
-      </w:r>
-    </w:p>
-    <w:p>
-      <w:pPr>
-        <w:pStyle w:val="BodyText"/>
-        <w:jc w:val="both"/>
-        <w:keepNext w:val="0"/>
-        <w:keepLines w:val="0"/>
-        <w:widowControl w:val="1"/>
-      </w:pPr>
-      <w:r>
-        <w:rPr>
-          <w:b/>
-          <w:bCs/>
-        </w:rPr>
-        <w:t xml:space="preserve">Answer:</w:t>
-      </w:r>
-      <w:r>
-        <w:t xml:space="preserve"> </w:t>
-      </w:r>
-      <w:r>
-        <w:t xml:space="preserve">Yes.</w:t>
-      </w:r>
-    </w:p>
-    <w:p>
-      <w:pPr>
-        <w:pStyle w:val="BodyText"/>
-        <w:jc w:val="both"/>
-        <w:keepNext w:val="0"/>
-        <w:keepLines w:val="0"/>
-        <w:widowControl w:val="1"/>
-      </w:pPr>
-      <w:r>
-        <w:rPr>
-          <w:b/>
-          <w:bCs/>
-        </w:rPr>
-        <w:t xml:space="preserve">Justification:</w:t>
-      </w:r>
-      <w:r>
-        <w:t xml:space="preserve"> </w:t>
-      </w:r>
-      <w:r>
-        <w:t xml:space="preserve">The research uses publicly available oral history transcripts from institutional archives. No human subjects were recruited for this study.</w:t>
-      </w:r>
-    </w:p>
-    <w:p>
-      <w:pPr>
-        <w:pStyle w:val="BodyText"/>
-        <w:jc w:val="both"/>
-        <w:keepNext w:val="0"/>
-        <w:keepLines w:val="0"/>
-        <w:widowControl w:val="1"/>
-      </w:pPr>
-      <w:r>
-        <w:t xml:space="preserve">10. Broader Impacts</w:t>
-      </w:r>
-    </w:p>
-    <w:p>
-      <w:pPr>
-        <w:pStyle w:val="BodyText"/>
-        <w:jc w:val="both"/>
-        <w:keepNext w:val="0"/>
-        <w:keepLines w:val="0"/>
-        <w:widowControl w:val="1"/>
-      </w:pPr>
-      <w:r>
-        <w:rPr>
-          <w:i/>
-          <w:iCs/>
-        </w:rPr>
-        <w:t xml:space="preserve">Question:</w:t>
-      </w:r>
-      <w:r>
-        <w:t xml:space="preserve"> </w:t>
-      </w:r>
-      <w:r>
-        <w:t xml:space="preserve">Does the paper discuss both potential positive societal impacts and negative societal impacts of the work?</w:t>
-      </w:r>
-    </w:p>
-    <w:p>
-      <w:pPr>
-        <w:pStyle w:val="BodyText"/>
-        <w:jc w:val="both"/>
-        <w:keepNext w:val="0"/>
-        <w:keepLines w:val="0"/>
-        <w:widowControl w:val="1"/>
-      </w:pPr>
-      <w:r>
-        <w:rPr>
-          <w:b/>
-          <w:bCs/>
-        </w:rPr>
-        <w:t xml:space="preserve">Answer:</w:t>
-      </w:r>
-      <w:r>
-        <w:t xml:space="preserve"> </w:t>
-      </w:r>
-      <w:r>
-        <w:t xml:space="preserve">Yes.</w:t>
-      </w:r>
-    </w:p>
-    <w:p>
-      <w:pPr>
-        <w:pStyle w:val="BodyText"/>
-        <w:jc w:val="both"/>
-        <w:keepNext w:val="0"/>
-        <w:keepLines w:val="0"/>
-        <w:widowControl w:val="1"/>
-      </w:pPr>
-      <w:r>
-        <w:rPr>
-          <w:b/>
-          <w:bCs/>
-        </w:rPr>
-        <w:t xml:space="preserve">Justification:</w:t>
-      </w:r>
-      <w:r>
-        <w:t xml:space="preserve"> </w:t>
-      </w:r>
-      <w:r>
-        <w:t xml:space="preserve">Positive impacts include improved accessibility of oral history archives and support for reminiscence therapy. The English-only, American-focused scope limits generalizability. The benchmark does not enable surveillance or profiling capabilities beyond what existing NER systems provide.</w:t>
-      </w:r>
-    </w:p>
-    <w:p>
-      <w:pPr>
-        <w:pStyle w:val="BodyText"/>
-        <w:jc w:val="both"/>
-        <w:keepNext w:val="0"/>
-        <w:keepLines w:val="0"/>
-        <w:widowControl w:val="1"/>
-      </w:pPr>
-      <w:r>
-        <w:t xml:space="preserve">11. Safeguards</w:t>
-      </w:r>
-    </w:p>
-    <w:p>
-      <w:pPr>
-        <w:pStyle w:val="BodyText"/>
-        <w:jc w:val="both"/>
-        <w:keepNext w:val="0"/>
-        <w:keepLines w:val="0"/>
-        <w:widowControl w:val="1"/>
-      </w:pPr>
-      <w:r>
-        <w:rPr>
-          <w:i/>
-          <w:iCs/>
-        </w:rPr>
-        <w:t xml:space="preserve">Question:</w:t>
-      </w:r>
-      <w:r>
-        <w:t xml:space="preserve"> </w:t>
-      </w:r>
-      <w:r>
-        <w:t xml:space="preserve">Does the paper describe safeguards that have been put in place for responsible release of data or models?</w:t>
-      </w:r>
-    </w:p>
-    <w:p>
-      <w:pPr>
-        <w:pStyle w:val="BodyText"/>
-        <w:jc w:val="both"/>
-        <w:keepNext w:val="0"/>
-        <w:keepLines w:val="0"/>
-        <w:widowControl w:val="1"/>
-      </w:pPr>
-      <w:r>
-        <w:rPr>
-          <w:b/>
-          <w:bCs/>
-        </w:rPr>
-        <w:t xml:space="preserve">Answer:</w:t>
-      </w:r>
-      <w:r>
-        <w:t xml:space="preserve"> </w:t>
-      </w:r>
-      <w:r>
-        <w:t xml:space="preserve">Yes.</w:t>
-      </w:r>
-    </w:p>
-    <w:p>
-      <w:pPr>
-        <w:pStyle w:val="BodyText"/>
-        <w:jc w:val="both"/>
-        <w:keepNext w:val="0"/>
-        <w:keepLines w:val="0"/>
-        <w:widowControl w:val="1"/>
-      </w:pPr>
-      <w:r>
-        <w:rPr>
-          <w:b/>
-          <w:bCs/>
-        </w:rPr>
-        <w:t xml:space="preserve">Justification:</w:t>
-      </w:r>
-      <w:r>
-        <w:t xml:space="preserve"> </w:t>
-      </w:r>
-      <w:r>
-        <w:t xml:space="preserve">The dataset is derived from publicly available oral history archives that were already consented and released by their respective institutions. No private or sensitive information beyond what is in the public transcripts is included.</w:t>
-      </w:r>
-    </w:p>
-    <w:p>
-      <w:pPr>
-        <w:pStyle w:val="BodyText"/>
-        <w:jc w:val="both"/>
-        <w:keepNext w:val="0"/>
-        <w:keepLines w:val="0"/>
-        <w:widowControl w:val="1"/>
-      </w:pPr>
-      <w:r>
-        <w:t xml:space="preserve">12. Licenses for Existing Assets</w:t>
-      </w:r>
-    </w:p>
-    <w:p>
-      <w:pPr>
-        <w:pStyle w:val="BodyText"/>
-        <w:jc w:val="both"/>
-        <w:keepNext w:val="0"/>
-        <w:keepLines w:val="0"/>
-        <w:widowControl w:val="1"/>
-      </w:pPr>
-      <w:r>
-        <w:rPr>
-          <w:i/>
-          <w:iCs/>
-        </w:rPr>
-        <w:t xml:space="preserve">Question:</w:t>
-      </w:r>
-      <w:r>
-        <w:t xml:space="preserve"> </w:t>
-      </w:r>
-      <w:r>
-        <w:t xml:space="preserve">Are the creators of existing assets (data, code, models) properly credited and are the license terms respected?</w:t>
-      </w:r>
-    </w:p>
-    <w:p>
-      <w:pPr>
-        <w:pStyle w:val="BodyText"/>
-        <w:jc w:val="both"/>
-        <w:keepNext w:val="0"/>
-        <w:keepLines w:val="0"/>
-        <w:widowControl w:val="1"/>
-      </w:pPr>
-      <w:r>
-        <w:rPr>
-          <w:b/>
-          <w:bCs/>
-        </w:rPr>
-        <w:t xml:space="preserve">Answer:</w:t>
-      </w:r>
-      <w:r>
-        <w:t xml:space="preserve"> </w:t>
-      </w:r>
-      <w:r>
-        <w:t xml:space="preserve">Yes.</w:t>
-      </w:r>
-    </w:p>
-    <w:p>
-      <w:pPr>
-        <w:pStyle w:val="BodyText"/>
-        <w:jc w:val="both"/>
-        <w:keepNext w:val="0"/>
-        <w:keepLines w:val="0"/>
-        <w:widowControl w:val="1"/>
-      </w:pPr>
-      <w:r>
-        <w:rPr>
-          <w:b/>
-          <w:bCs/>
-        </w:rPr>
-        <w:t xml:space="preserve">Justification:</w:t>
-      </w:r>
-      <w:r>
-        <w:t xml:space="preserve"> </w:t>
-      </w:r>
-      <w:r>
-        <w:t xml:space="preserve">All source collections are cited (Table 1). Models (Llama 3.1, BGE-base) are cited with their respective papers. All assets are used under their original licenses.</w:t>
-      </w:r>
-    </w:p>
-    <w:p>
-      <w:pPr>
-        <w:pStyle w:val="BodyText"/>
-        <w:jc w:val="both"/>
-        <w:keepNext w:val="0"/>
-        <w:keepLines w:val="0"/>
-        <w:widowControl w:val="1"/>
-      </w:pPr>
-      <w:r>
-        <w:t xml:space="preserve">13. New Assets</w:t>
-      </w:r>
-    </w:p>
-    <w:p>
-      <w:pPr>
-        <w:pStyle w:val="BodyText"/>
-        <w:jc w:val="both"/>
-        <w:keepNext w:val="0"/>
-        <w:keepLines w:val="0"/>
-        <w:widowControl w:val="1"/>
-      </w:pPr>
-      <w:r>
-        <w:rPr>
-          <w:i/>
-          <w:iCs/>
-        </w:rPr>
-        <w:t xml:space="preserve">Question:</w:t>
-      </w:r>
-      <w:r>
-        <w:t xml:space="preserve"> </w:t>
-      </w:r>
-      <w:r>
-        <w:t xml:space="preserve">Are new assets introduced in the paper well documented and is the documentation provided alongside the assets?</w:t>
-      </w:r>
-    </w:p>
-    <w:p>
-      <w:pPr>
-        <w:pStyle w:val="BodyText"/>
-        <w:jc w:val="both"/>
-        <w:keepNext w:val="0"/>
-        <w:keepLines w:val="0"/>
-        <w:widowControl w:val="1"/>
-      </w:pPr>
-      <w:r>
-        <w:rPr>
-          <w:b/>
-          <w:bCs/>
-        </w:rPr>
-        <w:t xml:space="preserve">Answer:</w:t>
-      </w:r>
-      <w:r>
-        <w:t xml:space="preserve"> </w:t>
-      </w:r>
-      <w:r>
-        <w:t xml:space="preserve">Yes.</w:t>
-      </w:r>
-    </w:p>
-    <w:p>
-      <w:pPr>
-        <w:pStyle w:val="BodyText"/>
-        <w:jc w:val="both"/>
-        <w:keepNext w:val="0"/>
-        <w:keepLines w:val="0"/>
-        <w:widowControl w:val="1"/>
-      </w:pPr>
-      <w:r>
-        <w:rPr>
-          <w:b/>
-          <w:bCs/>
-        </w:rPr>
-        <w:t xml:space="preserve">Justification:</w:t>
-      </w:r>
-      <w:r>
-        <w:t xml:space="preserve"> </w:t>
-      </w:r>
-      <w:r>
-        <w:t xml:space="preserve">IRC-Bench is documented with full statistics (Tables 1, 2), construction pipeline (Section 3, Figure 1), quality validation (Section 6), and will be released with a datasheet and usage documentation.</w:t>
-      </w:r>
-    </w:p>
-    <w:p>
-      <w:pPr>
-        <w:pStyle w:val="BodyText"/>
-        <w:jc w:val="both"/>
-        <w:keepNext w:val="0"/>
-        <w:keepLines w:val="0"/>
-        <w:widowControl w:val="1"/>
-      </w:pPr>
-      <w:r>
-        <w:t xml:space="preserve">14. Crowdsourcing and Research with Human Subjects</w:t>
-      </w:r>
-    </w:p>
-    <w:p>
-      <w:pPr>
-        <w:pStyle w:val="BodyText"/>
-        <w:jc w:val="both"/>
-        <w:keepNext w:val="0"/>
-        <w:keepLines w:val="0"/>
-        <w:widowControl w:val="1"/>
-      </w:pPr>
-      <w:r>
-        <w:rPr>
-          <w:i/>
-          <w:iCs/>
-        </w:rPr>
-        <w:t xml:space="preserve">Question:</w:t>
-      </w:r>
-      <w:r>
-        <w:t xml:space="preserve"> </w:t>
-      </w:r>
-      <w:r>
-        <w:t xml:space="preserve">For crowdsourcing experiments and research with human subjects, does the paper include the full text of instructions given to participants and screenshots, if applicable?</w:t>
-      </w:r>
-    </w:p>
-    <w:p>
-      <w:pPr>
-        <w:pStyle w:val="BodyText"/>
-        <w:jc w:val="both"/>
-        <w:keepNext w:val="0"/>
-        <w:keepLines w:val="0"/>
-        <w:widowControl w:val="1"/>
-      </w:pPr>
-      <w:r>
-        <w:rPr>
-          <w:b/>
-          <w:bCs/>
-        </w:rPr>
-        <w:t xml:space="preserve">Answer:</w:t>
-      </w:r>
-      <w:r>
-        <w:t xml:space="preserve"> </w:t>
-      </w:r>
-      <w:r>
-        <w:t xml:space="preserve">NA.</w:t>
-      </w:r>
-    </w:p>
-    <w:p>
-      <w:pPr>
-        <w:pStyle w:val="BodyText"/>
-        <w:jc w:val="both"/>
-        <w:keepNext w:val="0"/>
-        <w:keepLines w:val="0"/>
-        <w:widowControl w:val="1"/>
-      </w:pPr>
-      <w:r>
-        <w:rPr>
-          <w:b/>
-          <w:bCs/>
-        </w:rPr>
-        <w:t xml:space="preserve">Justification:</w:t>
-      </w:r>
-      <w:r>
-        <w:t xml:space="preserve"> </w:t>
-      </w:r>
-      <w:r>
-        <w:t xml:space="preserve">No crowdsourcing or human subjects research was conducted. Quality validation used automated GPT-4o assessment rather than human annotators.</w:t>
-      </w:r>
-    </w:p>
-    <w:p>
-      <w:pPr>
-        <w:pStyle w:val="BodyText"/>
-        <w:jc w:val="both"/>
-        <w:keepNext w:val="0"/>
-        <w:keepLines w:val="0"/>
-        <w:widowControl w:val="1"/>
-      </w:pPr>
-      <w:r>
-        <w:t xml:space="preserve">15. IRB Approvals or Equivalent for Research with Human Subjects</w:t>
-      </w:r>
-    </w:p>
-    <w:p>
-      <w:pPr>
-        <w:pStyle w:val="BodyText"/>
-        <w:jc w:val="both"/>
-        <w:keepNext w:val="0"/>
-        <w:keepLines w:val="0"/>
-        <w:widowControl w:val="1"/>
-      </w:pPr>
-      <w:r>
-        <w:rPr>
-          <w:i/>
-          <w:iCs/>
-        </w:rPr>
-        <w:t xml:space="preserve">Question:</w:t>
-      </w:r>
-      <w:r>
-        <w:t xml:space="preserve"> </w:t>
-      </w:r>
-      <w:r>
-        <w:t xml:space="preserve">Does the paper describe potential risks incurred by study participants?</w:t>
-      </w:r>
-    </w:p>
-    <w:p>
-      <w:pPr>
-        <w:pStyle w:val="BodyText"/>
-        <w:jc w:val="both"/>
-        <w:keepNext w:val="0"/>
-        <w:keepLines w:val="0"/>
-        <w:widowControl w:val="1"/>
-      </w:pPr>
-      <w:r>
-        <w:rPr>
-          <w:b/>
-          <w:bCs/>
-        </w:rPr>
-        <w:t xml:space="preserve">Answer:</w:t>
-      </w:r>
-      <w:r>
-        <w:t xml:space="preserve"> </w:t>
-      </w:r>
-      <w:r>
-        <w:t xml:space="preserve">NA.</w:t>
-      </w:r>
-    </w:p>
-    <w:p>
-      <w:pPr>
-        <w:pStyle w:val="BodyText"/>
-        <w:jc w:val="both"/>
-        <w:keepNext w:val="0"/>
-        <w:keepLines w:val="0"/>
-        <w:widowControl w:val="1"/>
-      </w:pPr>
-      <w:r>
-        <w:rPr>
-          <w:b/>
-          <w:bCs/>
-        </w:rPr>
-        <w:t xml:space="preserve">Justification:</w:t>
-      </w:r>
-      <w:r>
-        <w:t xml:space="preserve"> </w:t>
-      </w:r>
-      <w:r>
-        <w:t xml:space="preserve">No human subjects were involved. The data consists of previously published oral history transcripts from institutional archives.</w:t>
-      </w:r>
-    </w:p>
-    <w:p>
-      <w:pPr>
-        <w:pStyle w:val="BodyText"/>
-        <w:jc w:val="both"/>
-        <w:keepNext w:val="0"/>
-        <w:keepLines w:val="0"/>
-        <w:widowControl w:val="1"/>
-      </w:pPr>
-      <w:r>
-        <w:t xml:space="preserve">16. Dataset License</w:t>
-      </w:r>
-    </w:p>
-    <w:p>
-      <w:pPr>
-        <w:pStyle w:val="BodyText"/>
-        <w:jc w:val="both"/>
-        <w:keepNext w:val="0"/>
-        <w:keepLines w:val="0"/>
-        <w:widowControl w:val="1"/>
-      </w:pPr>
-      <w:r>
-        <w:rPr>
-          <w:i/>
-          <w:iCs/>
-        </w:rPr>
-        <w:t xml:space="preserve">Question:</w:t>
-      </w:r>
-      <w:r>
-        <w:t xml:space="preserve"> </w:t>
-      </w:r>
-      <w:r>
-        <w:t xml:space="preserve">Does the dataset have a license consistent with its intended use?</w:t>
-      </w:r>
-    </w:p>
-    <w:p>
-      <w:pPr>
-        <w:pStyle w:val="BodyText"/>
-        <w:jc w:val="both"/>
-        <w:keepNext w:val="0"/>
-        <w:keepLines w:val="0"/>
-        <w:widowControl w:val="1"/>
-      </w:pPr>
-      <w:r>
-        <w:rPr>
-          <w:b/>
-          <w:bCs/>
-        </w:rPr>
-        <w:t xml:space="preserve">Answer:</w:t>
-      </w:r>
-      <w:r>
-        <w:t xml:space="preserve"> </w:t>
-      </w:r>
-      <w:r>
-        <w:t xml:space="preserve">Yes.</w:t>
-      </w:r>
-    </w:p>
-    <w:p>
-      <w:pPr>
-        <w:pStyle w:val="BodyText"/>
-        <w:jc w:val="both"/>
-        <w:keepNext w:val="0"/>
-        <w:keepLines w:val="0"/>
-        <w:widowControl w:val="1"/>
-      </w:pPr>
-      <w:r>
-        <w:rPr>
-          <w:b/>
-          <w:bCs/>
-        </w:rPr>
-        <w:t xml:space="preserve">Justification:</w:t>
-      </w:r>
-      <w:r>
-        <w:t xml:space="preserve"> </w:t>
-      </w:r>
-      <w:r>
-        <w:t xml:space="preserve">IRC-Bench will be released under a permissive open-source license for research use. Source transcripts are from public domain and openly licensed institutional archives.</w:t>
-      </w:r>
-    </w:p>
-    <w:p>
-      <w:pPr>
-        <w:pStyle w:val="BodyText"/>
-        <w:jc w:val="both"/>
-        <w:keepNext w:val="0"/>
-        <w:keepLines w:val="0"/>
-        <w:widowControl w:val="1"/>
-      </w:pPr>
-      <w:r>
-        <w:t xml:space="preserve">17. Consent</w:t>
-      </w:r>
-    </w:p>
-    <w:p>
-      <w:pPr>
-        <w:pStyle w:val="BodyText"/>
-        <w:jc w:val="both"/>
-        <w:keepNext w:val="0"/>
-        <w:keepLines w:val="0"/>
-        <w:widowControl w:val="1"/>
-      </w:pPr>
-      <w:r>
-        <w:rPr>
-          <w:i/>
-          <w:iCs/>
-        </w:rPr>
-        <w:t xml:space="preserve">Question:</w:t>
-      </w:r>
-      <w:r>
-        <w:t xml:space="preserve"> </w:t>
-      </w:r>
-      <w:r>
-        <w:t xml:space="preserve">If the dataset relates to people, was consent obtained?</w:t>
-      </w:r>
-    </w:p>
-    <w:p>
-      <w:pPr>
-        <w:pStyle w:val="BodyText"/>
-        <w:jc w:val="both"/>
-        <w:keepNext w:val="0"/>
-        <w:keepLines w:val="0"/>
-        <w:widowControl w:val="1"/>
-      </w:pPr>
-      <w:r>
-        <w:rPr>
-          <w:b/>
-          <w:bCs/>
-        </w:rPr>
-        <w:t xml:space="preserve">Answer:</w:t>
-      </w:r>
-      <w:r>
-        <w:t xml:space="preserve"> </w:t>
-      </w:r>
-      <w:r>
-        <w:t xml:space="preserve">Yes.</w:t>
-      </w:r>
-    </w:p>
-    <w:p>
-      <w:pPr>
-        <w:pStyle w:val="BodyText"/>
-        <w:jc w:val="both"/>
-        <w:keepNext w:val="0"/>
-        <w:keepLines w:val="0"/>
-        <w:widowControl w:val="1"/>
-      </w:pPr>
-      <w:r>
-        <w:rPr>
-          <w:b/>
-          <w:bCs/>
-        </w:rPr>
-        <w:t xml:space="preserve">Justification:</w:t>
-      </w:r>
-      <w:r>
-        <w:t xml:space="preserve"> </w:t>
-      </w:r>
-      <w:r>
-        <w:t xml:space="preserve">All oral history transcripts were collected and published by their respective institutional archives (Library of Congress, universities, memorial projects) with informed consent from participants as part of standard oral history collection protocols.</w:t>
-      </w:r>
-    </w:p>
-    <w:p>
-      <w:pPr>
-        <w:pStyle w:val="BodyText"/>
-        <w:jc w:val="both"/>
-        <w:keepNext w:val="0"/>
-        <w:keepLines w:val="0"/>
-        <w:widowControl w:val="1"/>
-      </w:pPr>
-      <w:r>
-        <w:t xml:space="preserve">18. Personal Identifiable Information (PII)</w:t>
-      </w:r>
-    </w:p>
-    <w:p>
-      <w:pPr>
-        <w:pStyle w:val="BodyText"/>
-        <w:jc w:val="both"/>
-        <w:keepNext w:val="0"/>
-        <w:keepLines w:val="0"/>
-        <w:widowControl w:val="1"/>
-      </w:pPr>
-      <w:r>
-        <w:rPr>
-          <w:i/>
-          <w:iCs/>
-        </w:rPr>
-        <w:t xml:space="preserve">Question:</w:t>
-      </w:r>
-      <w:r>
-        <w:t xml:space="preserve"> </w:t>
-      </w:r>
-      <w:r>
-        <w:t xml:space="preserve">Does the dataset contain data that might be considered personal, sensitive, or private?</w:t>
-      </w:r>
-    </w:p>
-    <w:p>
-      <w:pPr>
-        <w:pStyle w:val="BodyText"/>
-        <w:jc w:val="both"/>
-        <w:keepNext w:val="0"/>
-        <w:keepLines w:val="0"/>
-        <w:widowControl w:val="1"/>
-      </w:pPr>
-      <w:r>
-        <w:rPr>
-          <w:b/>
-          <w:bCs/>
-        </w:rPr>
-        <w:t xml:space="preserve">Answer:</w:t>
-      </w:r>
-      <w:r>
-        <w:t xml:space="preserve"> </w:t>
-      </w:r>
-      <w:r>
-        <w:t xml:space="preserve">Yes.</w:t>
-      </w:r>
-    </w:p>
-    <w:p>
-      <w:pPr>
-        <w:pStyle w:val="BodyText"/>
-        <w:jc w:val="both"/>
-        <w:keepNext w:val="0"/>
-        <w:keepLines w:val="0"/>
-        <w:widowControl w:val="1"/>
-      </w:pPr>
-      <w:r>
-        <w:rPr>
-          <w:b/>
-          <w:bCs/>
-        </w:rPr>
-        <w:t xml:space="preserve">Justification:</w:t>
-      </w:r>
-      <w:r>
-        <w:t xml:space="preserve"> </w:t>
-      </w:r>
-      <w:r>
-        <w:t xml:space="preserve">The oral history transcripts contain personal narratives and names of individuals. However, all transcripts were previously published by their respective archives with participant consent, and the benchmark samples are derivative summaries rather than verbatim transcript excerpts.</w:t>
-      </w:r>
-    </w:p>
     <w:bookmarkEnd w:id="34"/>
     <w:sectPr>
       <w:footerReference w:type="default" r:id="rId15"/>

</xml_diff>

<commit_message>
NeurIPS docx: 7 OMML equations + 2 images, clean structure
Used KaTeX-to-MathML stage then pandoc from article/ dir.
Both math and images now present in single document.

Co-Authored-By: Claude Opus 4.6 (1M context) <noreply@anthropic.com>
</commit_message>
<xml_diff>
--- a/article/article_v4_neurips.docx
+++ b/article/article_v4_neurips.docx
@@ -2,7 +2,84 @@
 <file path=word/document.xml><?xml version="1.0" encoding="utf-8"?>
 <w:document xmlns:w="http://schemas.openxmlformats.org/wordprocessingml/2006/main" xmlns:m="http://schemas.openxmlformats.org/officeDocument/2006/math" xmlns:r="http://schemas.openxmlformats.org/officeDocument/2006/relationships" xmlns:o="urn:schemas-microsoft-com:office:office" xmlns:v="urn:schemas-microsoft-com:vml" xmlns:w10="urn:schemas-microsoft-com:office:word" xmlns:a="http://schemas.openxmlformats.org/drawingml/2006/main" xmlns:pic="http://schemas.openxmlformats.org/drawingml/2006/picture" xmlns:wp="http://schemas.openxmlformats.org/drawingml/2006/wordprocessingDrawing">
   <w:body>
-    <w:bookmarkStart w:id="20" w:name="Xfdafce19f76a9d69f8a466df1fd353418f3160a"/>
+    <w:p>
+      <w:pPr>
+        <w:pStyle w:val="Title"/>
+      </w:pPr>
+      <w:r>
+        <w:t xml:space="preserve">IRC-Bench:</w:t>
+      </w:r>
+      <w:r>
+        <w:t xml:space="preserve"> </w:t>
+      </w:r>
+      <w:r>
+        <w:t xml:space="preserve">Recognizing</w:t>
+      </w:r>
+      <w:r>
+        <w:t xml:space="preserve"> </w:t>
+      </w:r>
+      <w:r>
+        <w:t xml:space="preserve">Entities</w:t>
+      </w:r>
+      <w:r>
+        <w:t xml:space="preserve"> </w:t>
+      </w:r>
+      <w:r>
+        <w:t xml:space="preserve">from</w:t>
+      </w:r>
+      <w:r>
+        <w:t xml:space="preserve"> </w:t>
+      </w:r>
+      <w:r>
+        <w:t xml:space="preserve">Contextual</w:t>
+      </w:r>
+      <w:r>
+        <w:t xml:space="preserve"> </w:t>
+      </w:r>
+      <w:r>
+        <w:t xml:space="preserve">Cues</w:t>
+      </w:r>
+      <w:r>
+        <w:t xml:space="preserve"> </w:t>
+      </w:r>
+      <w:r>
+        <w:t xml:space="preserve">in</w:t>
+      </w:r>
+      <w:r>
+        <w:t xml:space="preserve"> </w:t>
+      </w:r>
+      <w:r>
+        <w:t xml:space="preserve">First-Person</w:t>
+      </w:r>
+      <w:r>
+        <w:t xml:space="preserve"> </w:t>
+      </w:r>
+      <w:r>
+        <w:t xml:space="preserve">Reminiscences</w:t>
+      </w:r>
+      <w:r>
+        <w:t xml:space="preserve"> </w:t>
+      </w:r>
+      <w:r>
+        <w:t xml:space="preserve">(NeurIPS</w:t>
+      </w:r>
+      <w:r>
+        <w:t xml:space="preserve"> </w:t>
+      </w:r>
+      <w:r>
+        <w:t xml:space="preserve">2026)</w:t>
+      </w:r>
+    </w:p>
+    <w:p>
+      <w:pPr>
+        <w:pStyle w:val="BodyText"/>
+        <w:jc w:val="both"/>
+      </w:pPr>
+      <w:r>
+        <w:t xml:space="preserve">40th Conference on Neural Information Processing Systems (NeurIPS 2026). Track on Evaluations and Datasets.</w:t>
+      </w:r>
+    </w:p>
+    <w:bookmarkStart w:id="26" w:name="Xfdafce19f76a9d69f8a466df1fd353418f3160a"/>
     <w:p>
       <w:pPr>
         <w:pStyle w:val="Heading1"/>
@@ -95,8 +172,8 @@
         <w:t xml:space="preserve">Intelligent Systems, Afeka Academic College of Engineering, Tel Aviv, Israel</w:t>
       </w:r>
     </w:p>
-    <w:bookmarkEnd w:id="20"/>
-    <w:bookmarkStart w:id="21" w:name="abstract"/>
+    <w:bookmarkEnd w:id="26"/>
+    <w:bookmarkStart w:id="27" w:name="abstract"/>
     <w:p>
       <w:pPr>
         <w:pStyle w:val="Heading2"/>
@@ -143,8 +220,8 @@
         <w:t xml:space="preserve">property of implicit references: recognition cues are distributed across non-contiguous clauses, distinguishing this task from NER, entity linking, and coreference resolution. We evaluate 19 configurations spanning open-world LLM generation, closed-world dense retrieval, hybrid RAG, and fine-tuning. QLoRA-adapted Llama 3.1 8B achieves 38.94% exact match (51.59% Jaccard), while fine-tuned DPR reaches 35.38% Hit@1 and 71.49% Hit@10. Chain-of-thought prompting consistently degrades performance, and RAG underperforms direct LLM inference. All data, code, and evaluation tools are publicly released.</w:t>
       </w:r>
     </w:p>
-    <w:bookmarkEnd w:id="21"/>
-    <w:bookmarkStart w:id="22" w:name="introduction"/>
+    <w:bookmarkEnd w:id="27"/>
+    <w:bookmarkStart w:id="28" w:name="introduction"/>
     <w:p>
       <w:pPr>
         <w:pStyle w:val="Heading2"/>
@@ -344,8 +421,8 @@
         <w:t xml:space="preserve">of implicit references. (2) We release IRC-Bench, a benchmark of 25,136 samples from 12,337 Wikidata-linked entities across 1,994 transcripts, with entity-level train/dev/test splits ensuring zero entity overlap. (3) We systematically compare 19 configurations spanning four paradigms (generative LLM, dense retrieval, RAG, fine-tuning), revealing that fine-tuning doubles performance, chain-of-thought reasoning degrades accuracy, and model scale is the dominant factor in open-world performance.</w:t>
       </w:r>
     </w:p>
-    <w:bookmarkEnd w:id="22"/>
-    <w:bookmarkStart w:id="23" w:name="related-work"/>
+    <w:bookmarkEnd w:id="28"/>
+    <w:bookmarkStart w:id="29" w:name="related-work"/>
     <w:p>
       <w:pPr>
         <w:pStyle w:val="Heading2"/>
@@ -363,8 +440,8 @@
         <w:t xml:space="preserve">Limited prior work has addressed entities that are referenced but never named. Hosseini [8] introduced implicit entity recognition in tweets, constructing a dataset of 3,119 tweets. Hosseini and Bagheri [9] developed learning-to-rank methods for this Twitter dataset. Perera et al. [10] explored implicit entity recognition in clinical documents. The coreference resolution community has studied "zero anaphora" and bridging references [11, 12], where entities are referenced indirectly. Computational approaches to reminiscence have focused on therapy systems using conversational agents [13, 14] and oral history processing for transcription and search [15, 16]; none address the challenge of identifying implicitly referenced entities. Our work differs from prior formulations in several ways. Reminiscence narratives are extended first-person accounts (50 to 200 words per sample) with rich, diffuse contextual cues, unlike short tweets or templated clinical notes. We formalize and empirically demonstrate the non-locality property: recognition requires integrating multiple non-contiguous cues. IRC-Bench contains 25,136 samples spanning 12,337 entities across 11 domains, compared to 3,119 tweet samples in Hosseini [8]. We introduce entity-level splitting with zero overlap and evaluate 19 configurations spanning four paradigms. The closest existing task is knowledge-grounded question answering [17, 18], where a system reasons over text and a knowledge base. While sharing the requirement for external knowledge, implicit entity recognition differs in that the "question" is an entire narrative, and the non-locality of cues causes standard RAG pipelines [19] to underperform direct LLM inference, as we show empirically.</w:t>
       </w:r>
     </w:p>
-    <w:bookmarkEnd w:id="23"/>
-    <w:bookmarkStart w:id="27" w:name="dataset-construction"/>
+    <w:bookmarkEnd w:id="29"/>
+    <w:bookmarkStart w:id="33" w:name="dataset-construction"/>
     <w:p>
       <w:pPr>
         <w:pStyle w:val="Heading2"/>
@@ -1152,18 +1229,18 @@
           <wp:inline>
             <wp:extent cx="5334000" cy="3025199"/>
             <wp:effectExtent b="0" l="0" r="0" t="0"/>
-            <wp:docPr descr="IRC-Bench construction pipeline" title="" id="25" name="Picture"/>
+            <wp:docPr descr="IRC-Bench construction pipeline" title="" id="31" name="Picture"/>
             <a:graphic>
               <a:graphicData uri="http://schemas.openxmlformats.org/drawingml/2006/picture">
                 <pic:pic>
                   <pic:nvPicPr>
-                    <pic:cNvPr descr="figures/fig0_pipeline.png" id="26" name="Picture"/>
+                    <pic:cNvPr descr="figures/fig0_pipeline.png" id="32" name="Picture"/>
                     <pic:cNvPicPr>
                       <a:picLocks noChangeArrowheads="1" noChangeAspect="1"/>
                     </pic:cNvPicPr>
                   </pic:nvPicPr>
                   <pic:blipFill>
-                    <a:blip r:embed="rId24"/>
+                    <a:blip r:embed="rId30"/>
                     <a:stretch>
                       <a:fillRect/>
                     </a:stretch>
@@ -1209,8 +1286,8 @@
         <w:t xml:space="preserve">IRC-Bench construction pipeline. Raw oral history transcripts undergo cleaning, NER with Wikidata linking, entity-grounded narrative generation, and entity elision to produce implicit entity recognition samples.</w:t>
       </w:r>
     </w:p>
-    <w:bookmarkEnd w:id="27"/>
-    <w:bookmarkStart w:id="34" w:name="methodology"/>
+    <w:bookmarkEnd w:id="33"/>
+    <w:bookmarkStart w:id="40" w:name="methodology"/>
     <w:p>
       <w:pPr>
         <w:pStyle w:val="Heading2"/>
@@ -1219,7 +1296,7 @@
         <w:t xml:space="preserve">4   Methodology</w:t>
       </w:r>
     </w:p>
-    <w:bookmarkStart w:id="28" w:name="task-formulation"/>
+    <w:bookmarkStart w:id="34" w:name="task-formulation"/>
     <w:p>
       <w:pPr>
         <w:pStyle w:val="Heading3"/>
@@ -1234,7 +1311,60 @@
         <w:jc w:val="both"/>
       </w:pPr>
       <w:r>
-        <w:t xml:space="preserve">Given a first-person narrative text $(t\$) that implicitly references a named entity $(e\$) without ever mentioning $(e\$) by name, the task is to identify $(e\$). We evaluate under two formulations. In the</w:t>
+        <w:t xml:space="preserve">Given a first-person narrative text</w:t>
+      </w:r>
+      <w:r>
+        <w:t xml:space="preserve"> </w:t>
+      </w:r>
+      <m:oMath>
+        <m:r>
+          <m:t>t</m:t>
+        </m:r>
+      </m:oMath>
+      <w:r>
+        <w:t xml:space="preserve"> </w:t>
+      </w:r>
+      <w:r>
+        <w:t xml:space="preserve">that implicitly references a named entity</w:t>
+      </w:r>
+      <w:r>
+        <w:t xml:space="preserve"> </w:t>
+      </w:r>
+      <m:oMath>
+        <m:r>
+          <m:t>e</m:t>
+        </m:r>
+      </m:oMath>
+      <w:r>
+        <w:t xml:space="preserve"> </w:t>
+      </w:r>
+      <w:r>
+        <w:t xml:space="preserve">without ever mentioning</w:t>
+      </w:r>
+      <w:r>
+        <w:t xml:space="preserve"> </w:t>
+      </w:r>
+      <m:oMath>
+        <m:r>
+          <m:t>e</m:t>
+        </m:r>
+      </m:oMath>
+      <w:r>
+        <w:t xml:space="preserve"> </w:t>
+      </w:r>
+      <w:r>
+        <w:t xml:space="preserve">by name, the task is to identify</w:t>
+      </w:r>
+      <w:r>
+        <w:t xml:space="preserve"> </w:t>
+      </w:r>
+      <m:oMath>
+        <m:r>
+          <m:t>e</m:t>
+        </m:r>
+      </m:oMath>
+      <w:r>
+        <w:t xml:space="preserve">. We evaluate under two formulations. In the</w:t>
       </w:r>
       <w:r>
         <w:t xml:space="preserve"> </w:t>
@@ -1269,8 +1399,8 @@
         <w:t xml:space="preserve">setting, the model ranks all 12,337 entities in the knowledge base by relevance to the query.</w:t>
       </w:r>
     </w:p>
-    <w:bookmarkEnd w:id="28"/>
-    <w:bookmarkStart w:id="29" w:name="the-non-locality-property"/>
+    <w:bookmarkEnd w:id="34"/>
+    <w:bookmarkStart w:id="35" w:name="the-non-locality-property"/>
     <w:p>
       <w:pPr>
         <w:pStyle w:val="Heading3"/>
@@ -1285,30 +1415,170 @@
         <w:jc w:val="both"/>
       </w:pPr>
       <w:r>
-        <w:t xml:space="preserve">We define a key structural property distinguishing implicit entity recognition from span-based tasks. Let $(C(T, e^*) = \${c_1, c_2,</w:t>
-      </w:r>
-      <w:r>
-        <w:t xml:space="preserve"> </w:t>
-      </w:r>
-      <w:r>
-        <w:t xml:space="preserve">$ldots, c_n\$}$</w:t>
-      </w:r>
-      <w:r>
-        <w:t xml:space="preserve">) denote the set of textual cues in \</w:t>
+        <w:t xml:space="preserve">We define a key structural property distinguishing implicit entity recognition from span-based tasks. Let</w:t>
+      </w:r>
+      <w:r>
+        <w:t xml:space="preserve"> </w:t>
       </w:r>
       <m:oMath>
+        <m:r>
+          <m:t>C</m:t>
+        </m:r>
+        <m:d>
+          <m:dPr>
+            <m:begChr m:val="("/>
+            <m:endChr m:val=")"/>
+            <m:sepChr m:val=""/>
+            <m:grow/>
+          </m:dPr>
+          <m:e>
+            <m:r>
+              <m:t>T</m:t>
+            </m:r>
+            <m:r>
+              <m:rPr>
+                <m:sty m:val="p"/>
+              </m:rPr>
+              <m:t>,</m:t>
+            </m:r>
+            <m:sSup>
+              <m:e>
+                <m:r>
+                  <m:t>e</m:t>
+                </m:r>
+              </m:e>
+              <m:sup>
+                <m:r>
+                  <m:rPr>
+                    <m:sty m:val="p"/>
+                  </m:rPr>
+                  <m:t>*</m:t>
+                </m:r>
+              </m:sup>
+            </m:sSup>
+          </m:e>
+        </m:d>
         <m:r>
           <m:rPr>
             <m:sty m:val="p"/>
           </m:rPr>
-          <m:t>(</m:t>
+          <m:t>=</m:t>
         </m:r>
+        <m:r>
+          <m:rPr>
+            <m:sty m:val="p"/>
+          </m:rPr>
+          <m:t>{</m:t>
+        </m:r>
+        <m:sSub>
+          <m:e>
+            <m:r>
+              <m:t>c</m:t>
+            </m:r>
+          </m:e>
+          <m:sub>
+            <m:r>
+              <m:t>1</m:t>
+            </m:r>
+          </m:sub>
+        </m:sSub>
+        <m:r>
+          <m:rPr>
+            <m:sty m:val="p"/>
+          </m:rPr>
+          <m:t>,</m:t>
+        </m:r>
+        <m:sSub>
+          <m:e>
+            <m:r>
+              <m:t>c</m:t>
+            </m:r>
+          </m:e>
+          <m:sub>
+            <m:r>
+              <m:t>2</m:t>
+            </m:r>
+          </m:sub>
+        </m:sSub>
+        <m:r>
+          <m:rPr>
+            <m:sty m:val="p"/>
+          </m:rPr>
+          <m:t>,</m:t>
+        </m:r>
+        <m:r>
+          <m:rPr>
+            <m:sty m:val="p"/>
+          </m:rPr>
+          <m:t>…</m:t>
+        </m:r>
+        <m:r>
+          <m:rPr>
+            <m:sty m:val="p"/>
+          </m:rPr>
+          <m:t>,</m:t>
+        </m:r>
+        <m:sSub>
+          <m:e>
+            <m:r>
+              <m:t>c</m:t>
+            </m:r>
+          </m:e>
+          <m:sub>
+            <m:r>
+              <m:t>n</m:t>
+            </m:r>
+          </m:sub>
+        </m:sSub>
+        <m:r>
+          <m:rPr>
+            <m:sty m:val="p"/>
+          </m:rPr>
+          <m:t>}</m:t>
+        </m:r>
+      </m:oMath>
+      <w:r>
+        <w:t xml:space="preserve"> </w:t>
+      </w:r>
+      <w:r>
+        <w:t xml:space="preserve">denote the set of textual cues in</w:t>
+      </w:r>
+      <w:r>
+        <w:t xml:space="preserve"> </w:t>
+      </w:r>
+      <m:oMath>
         <m:r>
           <m:t>T</m:t>
         </m:r>
       </m:oMath>
       <w:r>
-        <w:t xml:space="preserve">) that collectively identify \$(e^*\). In NER and EL, the entity is localized in a contiguous span. In implicit entity recognition, the entity is</w:t>
+        <w:t xml:space="preserve"> </w:t>
+      </w:r>
+      <w:r>
+        <w:t xml:space="preserve">that collectively identify</w:t>
+      </w:r>
+      <w:r>
+        <w:t xml:space="preserve"> </w:t>
+      </w:r>
+      <m:oMath>
+        <m:sSup>
+          <m:e>
+            <m:r>
+              <m:t>e</m:t>
+            </m:r>
+          </m:e>
+          <m:sup>
+            <m:r>
+              <m:rPr>
+                <m:sty m:val="p"/>
+              </m:rPr>
+              <m:t>*</m:t>
+            </m:r>
+          </m:sup>
+        </m:sSup>
+      </m:oMath>
+      <w:r>
+        <w:t xml:space="preserve">. In NER and EL, the entity is localized in a contiguous span. In implicit entity recognition, the entity is</w:t>
       </w:r>
       <w:r>
         <w:t xml:space="preserve"> </w:t>
@@ -1330,7 +1600,7 @@
         <w:jc w:val="both"/>
       </w:pPr>
       <w:r>
-        <w:t xml:space="preserve">$$$nexists \$; m $subset T \$;$text{s.t.}\$; m $text{ is contiguous} \$wedge m \Rightarrow e^*$$</w:t>
+        <w:t xml:space="preserve">$$\left. \nexists\text{\:\,}m \subset T\text{\:\,}\text{s.t.}\text{\:\,}m\text{~is~contiguous} \land m\Rightarrow e^{\ast} \right.$$</w:t>
       </w:r>
     </w:p>
     <w:p>
@@ -1339,7 +1609,7 @@
         <w:jc w:val="both"/>
       </w:pPr>
       <w:r>
-        <w:t xml:space="preserve">$$$text{but}\$; C(T,e^*) $Rightarrow e^*,\$; c_i \text{ non-contiguous}$$</w:t>
+        <w:t xml:space="preserve">$$\left. \text{but}\text{\:\,}C(T,e^{\ast})\Rightarrow e^{\ast},\text{\:\,}c_{i}\text{~non-contiguous} \right.$$</w:t>
       </w:r>
     </w:p>
     <w:p>
@@ -1351,8 +1621,8 @@
         <w:t xml:space="preserve">No single contiguous substring suffices, but the distributed cues collectively determine the entity. We validate this empirically: GPT-4o zero-shot accuracy on full implicit texts reaches 33.5%, while single-sentence accuracy drops to 12.9% (n=200), confirming that recognition requires integrating cues distributed across the entire passage.</w:t>
       </w:r>
     </w:p>
-    <w:bookmarkEnd w:id="29"/>
-    <w:bookmarkStart w:id="30" w:name="open-world-methods"/>
+    <w:bookmarkEnd w:id="35"/>
+    <w:bookmarkStart w:id="36" w:name="open-world-methods"/>
     <w:p>
       <w:pPr>
         <w:pStyle w:val="Heading3"/>
@@ -1370,8 +1640,8 @@
         <w:t xml:space="preserve">We evaluate LLMs in a generative setting with zero-shot (ZS), few-shot (FS, 5 demonstrations), and chain-of-thought (CoT) prompting. Models include GPT-4o [20], GPT-4.1-mini, and Llama 3.1 8B Instruct [21]. Direct prompting uses temperature 0.0; CoT uses temperature 0.7 with 300 output tokens. We additionally fine-tune Llama 3.1 8B using QLoRA [22, 23] with 4-bit NF4 quantization, LoRA rank 16, alpha 32, and 2 epochs on the train split. The entity-level split guarantees the model cannot memorize entity-specific patterns.</w:t>
       </w:r>
     </w:p>
-    <w:bookmarkEnd w:id="30"/>
-    <w:bookmarkStart w:id="31" w:name="closed-world-methods"/>
+    <w:bookmarkEnd w:id="36"/>
+    <w:bookmarkStart w:id="37" w:name="closed-world-methods"/>
     <w:p>
       <w:pPr>
         <w:pStyle w:val="Heading3"/>
@@ -1437,8 +1707,8 @@
         <w:t xml:space="preserve">(first Wikipedia sentence). We evaluate BAAI/bge-base-en-v1.5 [24] off-the-shelf and fine-tuned via Dense Passage Retrieval (DPR) [25] with Multiple Negatives Ranking Loss (3 epochs, batch size 48, learning rate 2e-5).</w:t>
       </w:r>
     </w:p>
-    <w:bookmarkEnd w:id="31"/>
-    <w:bookmarkStart w:id="32" w:name="rag-baseline"/>
+    <w:bookmarkEnd w:id="37"/>
+    <w:bookmarkStart w:id="38" w:name="rag-baseline"/>
     <w:p>
       <w:pPr>
         <w:pStyle w:val="Heading3"/>
@@ -1456,8 +1726,8 @@
         <w:t xml:space="preserve">A hybrid pipeline retrieves top-5 candidates via BGE-base, then GPT-4.1-mini reranks and selects the most likely entity. This tests whether LLM reranking can improve over pure embedding retrieval.</w:t>
       </w:r>
     </w:p>
-    <w:bookmarkEnd w:id="32"/>
-    <w:bookmarkStart w:id="33" w:name="evaluation-protocol"/>
+    <w:bookmarkEnd w:id="38"/>
+    <w:bookmarkStart w:id="39" w:name="evaluation-protocol"/>
     <w:p>
       <w:pPr>
         <w:pStyle w:val="Heading3"/>
@@ -1475,9 +1745,9 @@
         <w:t xml:space="preserve">We employ a four-tier matching hierarchy: (1) exact string match, (2) alias match via Wikidata, (3) containment match (substring), and (4) Jaccard similarity ≥ 0.5. The primary open-world metric is alias-aware accuracy (Tiers 1+2). Closed-world experiments report Hit@K, MRR, and alias-aware Hit@1. All key comparisons use McNemar's test for significance.</w:t>
       </w:r>
     </w:p>
-    <w:bookmarkEnd w:id="33"/>
-    <w:bookmarkEnd w:id="34"/>
-    <w:bookmarkStart w:id="41" w:name="results"/>
+    <w:bookmarkEnd w:id="39"/>
+    <w:bookmarkEnd w:id="40"/>
+    <w:bookmarkStart w:id="47" w:name="results"/>
     <w:p>
       <w:pPr>
         <w:pStyle w:val="Heading2"/>
@@ -1486,7 +1756,7 @@
         <w:t xml:space="preserve">5   Results</w:t>
       </w:r>
     </w:p>
-    <w:bookmarkStart w:id="38" w:name="open-world-performance"/>
+    <w:bookmarkStart w:id="44" w:name="open-world-performance"/>
     <w:p>
       <w:pPr>
         <w:pStyle w:val="Heading3"/>
@@ -2611,18 +2881,18 @@
           <wp:inline>
             <wp:extent cx="5334000" cy="5237602"/>
             <wp:effectExtent b="0" l="0" r="0" t="0"/>
-            <wp:docPr descr="Main results comparison across all methods" title="" id="36" name="Picture"/>
+            <wp:docPr descr="Main results comparison across all methods" title="" id="42" name="Picture"/>
             <a:graphic>
               <a:graphicData uri="http://schemas.openxmlformats.org/drawingml/2006/picture">
                 <pic:pic>
                   <pic:nvPicPr>
-                    <pic:cNvPr descr="figures/fig1_main_results.png" id="37" name="Picture"/>
+                    <pic:cNvPr descr="figures/fig1_main_results.png" id="43" name="Picture"/>
                     <pic:cNvPicPr>
                       <a:picLocks noChangeArrowheads="1" noChangeAspect="1"/>
                     </pic:cNvPicPr>
                   </pic:nvPicPr>
                   <pic:blipFill>
-                    <a:blip r:embed="rId35"/>
+                    <a:blip r:embed="rId41"/>
                     <a:stretch>
                       <a:fillRect/>
                     </a:stretch>
@@ -2668,8 +2938,8 @@
         <w:t xml:space="preserve">Comparison of open-world and closed-world methods on IRC-Bench. Open-world methods measured by exact match and alias-aware accuracy; closed-world methods by Hit@1 and Hit@10.</w:t>
       </w:r>
     </w:p>
-    <w:bookmarkEnd w:id="38"/>
-    <w:bookmarkStart w:id="39" w:name="closed-world-performance"/>
+    <w:bookmarkEnd w:id="44"/>
+    <w:bookmarkStart w:id="45" w:name="closed-world-performance"/>
     <w:p>
       <w:pPr>
         <w:pStyle w:val="Heading3"/>
@@ -3506,8 +3776,8 @@
         </w:tc>
       </w:tr>
     </w:tbl>
-    <w:bookmarkEnd w:id="39"/>
-    <w:bookmarkStart w:id="40" w:name="key-findings"/>
+    <w:bookmarkEnd w:id="45"/>
+    <w:bookmarkStart w:id="46" w:name="key-findings"/>
     <w:p>
       <w:pPr>
         <w:pStyle w:val="Heading3"/>
@@ -3611,9 +3881,9 @@
         <w:t xml:space="preserve">C5 (DPR+Desc) outperforms C4 (DPR+Name) by 5.38 pp on Hit@1 and C6 (DPR+Wiki) by 7.43 pp. The pattern holds for off-the-shelf BGE as well.</w:t>
       </w:r>
     </w:p>
-    <w:bookmarkEnd w:id="40"/>
-    <w:bookmarkEnd w:id="41"/>
-    <w:bookmarkStart w:id="42" w:name="discussion"/>
+    <w:bookmarkEnd w:id="46"/>
+    <w:bookmarkEnd w:id="47"/>
+    <w:bookmarkStart w:id="48" w:name="discussion"/>
     <w:p>
       <w:pPr>
         <w:pStyle w:val="Heading2"/>
@@ -3658,8 +3928,8 @@
         <w:t xml:space="preserve">Benchmark calibration validates the dataset's difficulty: an automated quality assessment (n=500, GPT-4o judge) found 42% of samples recoverable by informed judgment, closely matching the best system's alias accuracy (41.4%), suggesting top models approach the practical ceiling imposed by available cues. EEN naturalness averaged 4.87/5. Limitations include the English-only, American-focused scope; LLM-generated entity elision (though validated); alias-aware evaluation that still penalizes unregistered surface forms; and QLoRA's max_seq=192 tokens truncating approximately 6% of prompts.</w:t>
       </w:r>
     </w:p>
-    <w:bookmarkEnd w:id="42"/>
-    <w:bookmarkStart w:id="43" w:name="conclusion"/>
+    <w:bookmarkEnd w:id="48"/>
+    <w:bookmarkStart w:id="49" w:name="conclusion"/>
     <w:p>
       <w:pPr>
         <w:pStyle w:val="Heading2"/>
@@ -3677,8 +3947,8 @@
         <w:t xml:space="preserve">We have extended implicit entity recognition to long-form reminiscence narratives, formalizing the non-locality property and releasing IRC-Bench with 25,136 samples from 12,337 Wikidata-linked entities across 1,994 oral history transcripts. Our evaluation of 19 configurations reveals that fine-tuning is the most impactful intervention (QLoRA achieving 38.94% exact match, nearly tripling the base model), chain-of-thought prompting consistently degrades performance, and RAG underperforms direct inference due to the non-locality of implicit cues. Future work should explore combining DPR shortlists with LLM reranking (leveraging C5's 71.49% Hit@10), cross-lingual benchmarks, and architectures that explicitly model distributed cue structure.</w:t>
       </w:r>
     </w:p>
-    <w:bookmarkEnd w:id="43"/>
-    <w:bookmarkStart w:id="44" w:name="references"/>
+    <w:bookmarkEnd w:id="49"/>
+    <w:bookmarkStart w:id="50" w:name="references"/>
     <w:p>
       <w:pPr>
         <w:pStyle w:val="Heading2"/>
@@ -4514,7 +4784,7 @@
         <w:t xml:space="preserve">.</w:t>
       </w:r>
     </w:p>
-    <w:bookmarkEnd w:id="44"/>
+    <w:bookmarkEnd w:id="50"/>
     <w:p>
       <w:pPr>
         <w:pStyle w:val="BodyText"/>
@@ -4526,7 +4796,7 @@
       <w:r>
         <w:t xml:space="preserve"> </w:t>
       </w:r>
-      <w:hyperlink r:id="rId45">
+      <w:hyperlink r:id="rId51">
         <w:r>
           <w:rPr>
             <w:rStyle w:val="Hyperlink"/>

</xml_diff>

<commit_message>
NeurIPS docx: all 13 math equations native OMML + 2 images
Fixed display math by replacing KaTeX MathML with plain TeX
that pandoc converts to OMML. All inline and display math now
renders as editable Word equations.

Co-Authored-By: Claude Opus 4.6 (1M context) <noreply@anthropic.com>
</commit_message>
<xml_diff>
--- a/article/article_v4_neurips.docx
+++ b/article/article_v4_neurips.docx
@@ -2,84 +2,7 @@
 <file path=word/document.xml><?xml version="1.0" encoding="utf-8"?>
 <w:document xmlns:w="http://schemas.openxmlformats.org/wordprocessingml/2006/main" xmlns:m="http://schemas.openxmlformats.org/officeDocument/2006/math" xmlns:r="http://schemas.openxmlformats.org/officeDocument/2006/relationships" xmlns:o="urn:schemas-microsoft-com:office:office" xmlns:v="urn:schemas-microsoft-com:vml" xmlns:w10="urn:schemas-microsoft-com:office:word" xmlns:a="http://schemas.openxmlformats.org/drawingml/2006/main" xmlns:pic="http://schemas.openxmlformats.org/drawingml/2006/picture" xmlns:wp="http://schemas.openxmlformats.org/drawingml/2006/wordprocessingDrawing">
   <w:body>
-    <w:p>
-      <w:pPr>
-        <w:pStyle w:val="Title"/>
-      </w:pPr>
-      <w:r>
-        <w:t xml:space="preserve">IRC-Bench:</w:t>
-      </w:r>
-      <w:r>
-        <w:t xml:space="preserve"> </w:t>
-      </w:r>
-      <w:r>
-        <w:t xml:space="preserve">Recognizing</w:t>
-      </w:r>
-      <w:r>
-        <w:t xml:space="preserve"> </w:t>
-      </w:r>
-      <w:r>
-        <w:t xml:space="preserve">Entities</w:t>
-      </w:r>
-      <w:r>
-        <w:t xml:space="preserve"> </w:t>
-      </w:r>
-      <w:r>
-        <w:t xml:space="preserve">from</w:t>
-      </w:r>
-      <w:r>
-        <w:t xml:space="preserve"> </w:t>
-      </w:r>
-      <w:r>
-        <w:t xml:space="preserve">Contextual</w:t>
-      </w:r>
-      <w:r>
-        <w:t xml:space="preserve"> </w:t>
-      </w:r>
-      <w:r>
-        <w:t xml:space="preserve">Cues</w:t>
-      </w:r>
-      <w:r>
-        <w:t xml:space="preserve"> </w:t>
-      </w:r>
-      <w:r>
-        <w:t xml:space="preserve">in</w:t>
-      </w:r>
-      <w:r>
-        <w:t xml:space="preserve"> </w:t>
-      </w:r>
-      <w:r>
-        <w:t xml:space="preserve">First-Person</w:t>
-      </w:r>
-      <w:r>
-        <w:t xml:space="preserve"> </w:t>
-      </w:r>
-      <w:r>
-        <w:t xml:space="preserve">Reminiscences</w:t>
-      </w:r>
-      <w:r>
-        <w:t xml:space="preserve"> </w:t>
-      </w:r>
-      <w:r>
-        <w:t xml:space="preserve">(NeurIPS</w:t>
-      </w:r>
-      <w:r>
-        <w:t xml:space="preserve"> </w:t>
-      </w:r>
-      <w:r>
-        <w:t xml:space="preserve">2026)</w:t>
-      </w:r>
-    </w:p>
-    <w:p>
-      <w:pPr>
-        <w:pStyle w:val="BodyText"/>
-        <w:jc w:val="both"/>
-      </w:pPr>
-      <w:r>
-        <w:t xml:space="preserve">40th Conference on Neural Information Processing Systems (NeurIPS 2026). Track on Evaluations and Datasets.</w:t>
-      </w:r>
-    </w:p>
-    <w:bookmarkStart w:id="26" w:name="Xfdafce19f76a9d69f8a466df1fd353418f3160a"/>
+    <w:bookmarkStart w:id="20" w:name="Xfdafce19f76a9d69f8a466df1fd353418f3160a"/>
     <w:p>
       <w:pPr>
         <w:pStyle w:val="Heading1"/>
@@ -172,8 +95,8 @@
         <w:t xml:space="preserve">Intelligent Systems, Afeka Academic College of Engineering, Tel Aviv, Israel</w:t>
       </w:r>
     </w:p>
-    <w:bookmarkEnd w:id="26"/>
-    <w:bookmarkStart w:id="27" w:name="abstract"/>
+    <w:bookmarkEnd w:id="20"/>
+    <w:bookmarkStart w:id="21" w:name="abstract"/>
     <w:p>
       <w:pPr>
         <w:pStyle w:val="Heading2"/>
@@ -220,8 +143,8 @@
         <w:t xml:space="preserve">property of implicit references: recognition cues are distributed across non-contiguous clauses, distinguishing this task from NER, entity linking, and coreference resolution. We evaluate 19 configurations spanning open-world LLM generation, closed-world dense retrieval, hybrid RAG, and fine-tuning. QLoRA-adapted Llama 3.1 8B achieves 38.94% exact match (51.59% Jaccard), while fine-tuned DPR reaches 35.38% Hit@1 and 71.49% Hit@10. Chain-of-thought prompting consistently degrades performance, and RAG underperforms direct LLM inference. All data, code, and evaluation tools are publicly released.</w:t>
       </w:r>
     </w:p>
-    <w:bookmarkEnd w:id="27"/>
-    <w:bookmarkStart w:id="28" w:name="introduction"/>
+    <w:bookmarkEnd w:id="21"/>
+    <w:bookmarkStart w:id="22" w:name="introduction"/>
     <w:p>
       <w:pPr>
         <w:pStyle w:val="Heading2"/>
@@ -421,8 +344,8 @@
         <w:t xml:space="preserve">of implicit references. (2) We release IRC-Bench, a benchmark of 25,136 samples from 12,337 Wikidata-linked entities across 1,994 transcripts, with entity-level train/dev/test splits ensuring zero entity overlap. (3) We systematically compare 19 configurations spanning four paradigms (generative LLM, dense retrieval, RAG, fine-tuning), revealing that fine-tuning doubles performance, chain-of-thought reasoning degrades accuracy, and model scale is the dominant factor in open-world performance.</w:t>
       </w:r>
     </w:p>
-    <w:bookmarkEnd w:id="28"/>
-    <w:bookmarkStart w:id="29" w:name="related-work"/>
+    <w:bookmarkEnd w:id="22"/>
+    <w:bookmarkStart w:id="23" w:name="related-work"/>
     <w:p>
       <w:pPr>
         <w:pStyle w:val="Heading2"/>
@@ -440,8 +363,8 @@
         <w:t xml:space="preserve">Limited prior work has addressed entities that are referenced but never named. Hosseini [8] introduced implicit entity recognition in tweets, constructing a dataset of 3,119 tweets. Hosseini and Bagheri [9] developed learning-to-rank methods for this Twitter dataset. Perera et al. [10] explored implicit entity recognition in clinical documents. The coreference resolution community has studied "zero anaphora" and bridging references [11, 12], where entities are referenced indirectly. Computational approaches to reminiscence have focused on therapy systems using conversational agents [13, 14] and oral history processing for transcription and search [15, 16]; none address the challenge of identifying implicitly referenced entities. Our work differs from prior formulations in several ways. Reminiscence narratives are extended first-person accounts (50 to 200 words per sample) with rich, diffuse contextual cues, unlike short tweets or templated clinical notes. We formalize and empirically demonstrate the non-locality property: recognition requires integrating multiple non-contiguous cues. IRC-Bench contains 25,136 samples spanning 12,337 entities across 11 domains, compared to 3,119 tweet samples in Hosseini [8]. We introduce entity-level splitting with zero overlap and evaluate 19 configurations spanning four paradigms. The closest existing task is knowledge-grounded question answering [17, 18], where a system reasons over text and a knowledge base. While sharing the requirement for external knowledge, implicit entity recognition differs in that the "question" is an entire narrative, and the non-locality of cues causes standard RAG pipelines [19] to underperform direct LLM inference, as we show empirically.</w:t>
       </w:r>
     </w:p>
-    <w:bookmarkEnd w:id="29"/>
-    <w:bookmarkStart w:id="33" w:name="dataset-construction"/>
+    <w:bookmarkEnd w:id="23"/>
+    <w:bookmarkStart w:id="27" w:name="dataset-construction"/>
     <w:p>
       <w:pPr>
         <w:pStyle w:val="Heading2"/>
@@ -1229,18 +1152,18 @@
           <wp:inline>
             <wp:extent cx="5334000" cy="3025199"/>
             <wp:effectExtent b="0" l="0" r="0" t="0"/>
-            <wp:docPr descr="IRC-Bench construction pipeline" title="" id="31" name="Picture"/>
+            <wp:docPr descr="IRC-Bench construction pipeline" title="" id="25" name="Picture"/>
             <a:graphic>
               <a:graphicData uri="http://schemas.openxmlformats.org/drawingml/2006/picture">
                 <pic:pic>
                   <pic:nvPicPr>
-                    <pic:cNvPr descr="figures/fig0_pipeline.png" id="32" name="Picture"/>
+                    <pic:cNvPr descr="figures/fig0_pipeline.png" id="26" name="Picture"/>
                     <pic:cNvPicPr>
                       <a:picLocks noChangeArrowheads="1" noChangeAspect="1"/>
                     </pic:cNvPicPr>
                   </pic:nvPicPr>
                   <pic:blipFill>
-                    <a:blip r:embed="rId30"/>
+                    <a:blip r:embed="rId24"/>
                     <a:stretch>
                       <a:fillRect/>
                     </a:stretch>
@@ -1286,8 +1209,8 @@
         <w:t xml:space="preserve">IRC-Bench construction pipeline. Raw oral history transcripts undergo cleaning, NER with Wikidata linking, entity-grounded narrative generation, and entity elision to produce implicit entity recognition samples.</w:t>
       </w:r>
     </w:p>
-    <w:bookmarkEnd w:id="33"/>
-    <w:bookmarkStart w:id="40" w:name="methodology"/>
+    <w:bookmarkEnd w:id="27"/>
+    <w:bookmarkStart w:id="34" w:name="methodology"/>
     <w:p>
       <w:pPr>
         <w:pStyle w:val="Heading2"/>
@@ -1296,7 +1219,7 @@
         <w:t xml:space="preserve">4   Methodology</w:t>
       </w:r>
     </w:p>
-    <w:bookmarkStart w:id="34" w:name="task-formulation"/>
+    <w:bookmarkStart w:id="28" w:name="task-formulation"/>
     <w:p>
       <w:pPr>
         <w:pStyle w:val="Heading3"/>
@@ -1399,8 +1322,8 @@
         <w:t xml:space="preserve">setting, the model ranks all 12,337 entities in the knowledge base by relevance to the query.</w:t>
       </w:r>
     </w:p>
-    <w:bookmarkEnd w:id="34"/>
-    <w:bookmarkStart w:id="35" w:name="the-non-locality-property"/>
+    <w:bookmarkEnd w:id="28"/>
+    <w:bookmarkStart w:id="29" w:name="the-non-locality-property"/>
     <w:p>
       <w:pPr>
         <w:pStyle w:val="Heading3"/>
@@ -1599,18 +1522,330 @@
         <w:pStyle w:val="BodyText"/>
         <w:jc w:val="both"/>
       </w:pPr>
-      <w:r>
-        <w:t xml:space="preserve">$$\left. \nexists\text{\:\,}m \subset T\text{\:\,}\text{s.t.}\text{\:\,}m\text{~is~contiguous} \land m\Rightarrow e^{\ast} \right.$$</w:t>
-      </w:r>
+      <m:oMathPara>
+        <m:oMathParaPr>
+          <m:jc m:val="center"/>
+        </m:oMathParaPr>
+        <m:oMath>
+          <m:r>
+            <m:t>e</m:t>
+          </m:r>
+          <m:r>
+            <m:t>x</m:t>
+          </m:r>
+          <m:r>
+            <m:t>i</m:t>
+          </m:r>
+          <m:r>
+            <m:t>s</m:t>
+          </m:r>
+          <m:r>
+            <m:t>t</m:t>
+          </m:r>
+          <m:r>
+            <m:t>s</m:t>
+          </m:r>
+          <m:r>
+            <m:t> </m:t>
+          </m:r>
+          <m:r>
+            <m:t>m</m:t>
+          </m:r>
+          <m:r>
+            <m:rPr>
+              <m:sty m:val="p"/>
+            </m:rPr>
+            <m:t>⊂</m:t>
+          </m:r>
+          <m:r>
+            <m:t>T</m:t>
+          </m:r>
+          <m:r>
+            <m:t> </m:t>
+          </m:r>
+          <m:r>
+            <m:t>e</m:t>
+          </m:r>
+          <m:r>
+            <m:t>x</m:t>
+          </m:r>
+          <m:r>
+            <m:t>t</m:t>
+          </m:r>
+          <m:r>
+            <m:t>s</m:t>
+          </m:r>
+          <m:r>
+            <m:rPr>
+              <m:sty m:val="p"/>
+            </m:rPr>
+            <m:t>.</m:t>
+          </m:r>
+          <m:r>
+            <m:t>t</m:t>
+          </m:r>
+          <m:r>
+            <m:rPr>
+              <m:sty m:val="p"/>
+            </m:rPr>
+            <m:t>.</m:t>
+          </m:r>
+          <m:r>
+            <m:t> </m:t>
+          </m:r>
+          <m:r>
+            <m:t>m</m:t>
+          </m:r>
+          <m:r>
+            <m:t> </m:t>
+          </m:r>
+          <m:r>
+            <m:t>e</m:t>
+          </m:r>
+          <m:r>
+            <m:t>x</m:t>
+          </m:r>
+          <m:r>
+            <m:t>t</m:t>
+          </m:r>
+          <m:r>
+            <m:t>i</m:t>
+          </m:r>
+          <m:r>
+            <m:t>s</m:t>
+          </m:r>
+          <m:r>
+            <m:t>c</m:t>
+          </m:r>
+          <m:r>
+            <m:t>o</m:t>
+          </m:r>
+          <m:r>
+            <m:t>n</m:t>
+          </m:r>
+          <m:r>
+            <m:t>t</m:t>
+          </m:r>
+          <m:r>
+            <m:t>i</m:t>
+          </m:r>
+          <m:r>
+            <m:t>g</m:t>
+          </m:r>
+          <m:r>
+            <m:t>u</m:t>
+          </m:r>
+          <m:r>
+            <m:t>o</m:t>
+          </m:r>
+          <m:r>
+            <m:t>u</m:t>
+          </m:r>
+          <m:r>
+            <m:t>s</m:t>
+          </m:r>
+          <m:r>
+            <m:rPr>
+              <m:sty m:val="p"/>
+            </m:rPr>
+            <m:t>∧</m:t>
+          </m:r>
+          <m:r>
+            <m:t>m</m:t>
+          </m:r>
+          <m:r>
+            <m:rPr>
+              <m:sty m:val="p"/>
+            </m:rPr>
+            <m:t>⇒</m:t>
+          </m:r>
+          <m:sSup>
+            <m:e>
+              <m:r>
+                <m:t>e</m:t>
+              </m:r>
+            </m:e>
+            <m:sup>
+              <m:r>
+                <m:rPr>
+                  <m:sty m:val="p"/>
+                </m:rPr>
+                <m:t>*</m:t>
+              </m:r>
+            </m:sup>
+          </m:sSup>
+        </m:oMath>
+      </m:oMathPara>
     </w:p>
     <w:p>
       <w:pPr>
         <w:pStyle w:val="FirstParagraph"/>
         <w:jc w:val="both"/>
       </w:pPr>
-      <w:r>
-        <w:t xml:space="preserve">$$\left. \text{but}\text{\:\,}C(T,e^{\ast})\Rightarrow e^{\ast},\text{\:\,}c_{i}\text{~non-contiguous} \right.$$</w:t>
-      </w:r>
+      <m:oMathPara>
+        <m:oMathParaPr>
+          <m:jc m:val="center"/>
+        </m:oMathParaPr>
+        <m:oMath>
+          <m:r>
+            <m:t>e</m:t>
+          </m:r>
+          <m:r>
+            <m:t>x</m:t>
+          </m:r>
+          <m:r>
+            <m:t>t</m:t>
+          </m:r>
+          <m:r>
+            <m:t>b</m:t>
+          </m:r>
+          <m:r>
+            <m:t>u</m:t>
+          </m:r>
+          <m:r>
+            <m:t>t</m:t>
+          </m:r>
+          <m:r>
+            <m:t> </m:t>
+          </m:r>
+          <m:r>
+            <m:t>C</m:t>
+          </m:r>
+          <m:d>
+            <m:dPr>
+              <m:begChr m:val="("/>
+              <m:endChr m:val=")"/>
+              <m:sepChr m:val=""/>
+              <m:grow/>
+            </m:dPr>
+            <m:e>
+              <m:r>
+                <m:t>T</m:t>
+              </m:r>
+              <m:r>
+                <m:rPr>
+                  <m:sty m:val="p"/>
+                </m:rPr>
+                <m:t>,</m:t>
+              </m:r>
+              <m:sSup>
+                <m:e>
+                  <m:r>
+                    <m:t>e</m:t>
+                  </m:r>
+                </m:e>
+                <m:sup>
+                  <m:r>
+                    <m:rPr>
+                      <m:sty m:val="p"/>
+                    </m:rPr>
+                    <m:t>*</m:t>
+                  </m:r>
+                </m:sup>
+              </m:sSup>
+            </m:e>
+          </m:d>
+          <m:r>
+            <m:rPr>
+              <m:sty m:val="p"/>
+            </m:rPr>
+            <m:t>⇒</m:t>
+          </m:r>
+          <m:sSup>
+            <m:e>
+              <m:r>
+                <m:t>e</m:t>
+              </m:r>
+            </m:e>
+            <m:sup>
+              <m:r>
+                <m:rPr>
+                  <m:sty m:val="p"/>
+                </m:rPr>
+                <m:t>*</m:t>
+              </m:r>
+            </m:sup>
+          </m:sSup>
+          <m:r>
+            <m:rPr>
+              <m:sty m:val="p"/>
+            </m:rPr>
+            <m:t>,</m:t>
+          </m:r>
+          <m:r>
+            <m:t> </m:t>
+          </m:r>
+          <m:sSub>
+            <m:e>
+              <m:r>
+                <m:t>c</m:t>
+              </m:r>
+            </m:e>
+            <m:sub>
+              <m:r>
+                <m:t>i</m:t>
+              </m:r>
+            </m:sub>
+          </m:sSub>
+          <m:r>
+            <m:t> </m:t>
+          </m:r>
+          <m:r>
+            <m:t>e</m:t>
+          </m:r>
+          <m:r>
+            <m:t>x</m:t>
+          </m:r>
+          <m:r>
+            <m:t>t</m:t>
+          </m:r>
+          <m:r>
+            <m:t>n</m:t>
+          </m:r>
+          <m:r>
+            <m:t>o</m:t>
+          </m:r>
+          <m:r>
+            <m:t>n</m:t>
+          </m:r>
+          <m:r>
+            <m:rPr>
+              <m:sty m:val="p"/>
+            </m:rPr>
+            <m:t>−</m:t>
+          </m:r>
+          <m:r>
+            <m:t>c</m:t>
+          </m:r>
+          <m:r>
+            <m:t>o</m:t>
+          </m:r>
+          <m:r>
+            <m:t>n</m:t>
+          </m:r>
+          <m:r>
+            <m:t>t</m:t>
+          </m:r>
+          <m:r>
+            <m:t>i</m:t>
+          </m:r>
+          <m:r>
+            <m:t>g</m:t>
+          </m:r>
+          <m:r>
+            <m:t>u</m:t>
+          </m:r>
+          <m:r>
+            <m:t>o</m:t>
+          </m:r>
+          <m:r>
+            <m:t>u</m:t>
+          </m:r>
+          <m:r>
+            <m:t>s</m:t>
+          </m:r>
+        </m:oMath>
+      </m:oMathPara>
     </w:p>
     <w:p>
       <w:pPr>
@@ -1621,8 +1856,8 @@
         <w:t xml:space="preserve">No single contiguous substring suffices, but the distributed cues collectively determine the entity. We validate this empirically: GPT-4o zero-shot accuracy on full implicit texts reaches 33.5%, while single-sentence accuracy drops to 12.9% (n=200), confirming that recognition requires integrating cues distributed across the entire passage.</w:t>
       </w:r>
     </w:p>
-    <w:bookmarkEnd w:id="35"/>
-    <w:bookmarkStart w:id="36" w:name="open-world-methods"/>
+    <w:bookmarkEnd w:id="29"/>
+    <w:bookmarkStart w:id="30" w:name="open-world-methods"/>
     <w:p>
       <w:pPr>
         <w:pStyle w:val="Heading3"/>
@@ -1640,8 +1875,8 @@
         <w:t xml:space="preserve">We evaluate LLMs in a generative setting with zero-shot (ZS), few-shot (FS, 5 demonstrations), and chain-of-thought (CoT) prompting. Models include GPT-4o [20], GPT-4.1-mini, and Llama 3.1 8B Instruct [21]. Direct prompting uses temperature 0.0; CoT uses temperature 0.7 with 300 output tokens. We additionally fine-tune Llama 3.1 8B using QLoRA [22, 23] with 4-bit NF4 quantization, LoRA rank 16, alpha 32, and 2 epochs on the train split. The entity-level split guarantees the model cannot memorize entity-specific patterns.</w:t>
       </w:r>
     </w:p>
-    <w:bookmarkEnd w:id="36"/>
-    <w:bookmarkStart w:id="37" w:name="closed-world-methods"/>
+    <w:bookmarkEnd w:id="30"/>
+    <w:bookmarkStart w:id="31" w:name="closed-world-methods"/>
     <w:p>
       <w:pPr>
         <w:pStyle w:val="Heading3"/>
@@ -1707,8 +1942,8 @@
         <w:t xml:space="preserve">(first Wikipedia sentence). We evaluate BAAI/bge-base-en-v1.5 [24] off-the-shelf and fine-tuned via Dense Passage Retrieval (DPR) [25] with Multiple Negatives Ranking Loss (3 epochs, batch size 48, learning rate 2e-5).</w:t>
       </w:r>
     </w:p>
-    <w:bookmarkEnd w:id="37"/>
-    <w:bookmarkStart w:id="38" w:name="rag-baseline"/>
+    <w:bookmarkEnd w:id="31"/>
+    <w:bookmarkStart w:id="32" w:name="rag-baseline"/>
     <w:p>
       <w:pPr>
         <w:pStyle w:val="Heading3"/>
@@ -1726,8 +1961,8 @@
         <w:t xml:space="preserve">A hybrid pipeline retrieves top-5 candidates via BGE-base, then GPT-4.1-mini reranks and selects the most likely entity. This tests whether LLM reranking can improve over pure embedding retrieval.</w:t>
       </w:r>
     </w:p>
-    <w:bookmarkEnd w:id="38"/>
-    <w:bookmarkStart w:id="39" w:name="evaluation-protocol"/>
+    <w:bookmarkEnd w:id="32"/>
+    <w:bookmarkStart w:id="33" w:name="evaluation-protocol"/>
     <w:p>
       <w:pPr>
         <w:pStyle w:val="Heading3"/>
@@ -1745,9 +1980,9 @@
         <w:t xml:space="preserve">We employ a four-tier matching hierarchy: (1) exact string match, (2) alias match via Wikidata, (3) containment match (substring), and (4) Jaccard similarity ≥ 0.5. The primary open-world metric is alias-aware accuracy (Tiers 1+2). Closed-world experiments report Hit@K, MRR, and alias-aware Hit@1. All key comparisons use McNemar's test for significance.</w:t>
       </w:r>
     </w:p>
-    <w:bookmarkEnd w:id="39"/>
-    <w:bookmarkEnd w:id="40"/>
-    <w:bookmarkStart w:id="47" w:name="results"/>
+    <w:bookmarkEnd w:id="33"/>
+    <w:bookmarkEnd w:id="34"/>
+    <w:bookmarkStart w:id="41" w:name="results"/>
     <w:p>
       <w:pPr>
         <w:pStyle w:val="Heading2"/>
@@ -1756,7 +1991,7 @@
         <w:t xml:space="preserve">5   Results</w:t>
       </w:r>
     </w:p>
-    <w:bookmarkStart w:id="44" w:name="open-world-performance"/>
+    <w:bookmarkStart w:id="38" w:name="open-world-performance"/>
     <w:p>
       <w:pPr>
         <w:pStyle w:val="Heading3"/>
@@ -2881,18 +3116,18 @@
           <wp:inline>
             <wp:extent cx="5334000" cy="5237602"/>
             <wp:effectExtent b="0" l="0" r="0" t="0"/>
-            <wp:docPr descr="Main results comparison across all methods" title="" id="42" name="Picture"/>
+            <wp:docPr descr="Main results comparison across all methods" title="" id="36" name="Picture"/>
             <a:graphic>
               <a:graphicData uri="http://schemas.openxmlformats.org/drawingml/2006/picture">
                 <pic:pic>
                   <pic:nvPicPr>
-                    <pic:cNvPr descr="figures/fig1_main_results.png" id="43" name="Picture"/>
+                    <pic:cNvPr descr="figures/fig1_main_results.png" id="37" name="Picture"/>
                     <pic:cNvPicPr>
                       <a:picLocks noChangeArrowheads="1" noChangeAspect="1"/>
                     </pic:cNvPicPr>
                   </pic:nvPicPr>
                   <pic:blipFill>
-                    <a:blip r:embed="rId41"/>
+                    <a:blip r:embed="rId35"/>
                     <a:stretch>
                       <a:fillRect/>
                     </a:stretch>
@@ -2938,8 +3173,8 @@
         <w:t xml:space="preserve">Comparison of open-world and closed-world methods on IRC-Bench. Open-world methods measured by exact match and alias-aware accuracy; closed-world methods by Hit@1 and Hit@10.</w:t>
       </w:r>
     </w:p>
-    <w:bookmarkEnd w:id="44"/>
-    <w:bookmarkStart w:id="45" w:name="closed-world-performance"/>
+    <w:bookmarkEnd w:id="38"/>
+    <w:bookmarkStart w:id="39" w:name="closed-world-performance"/>
     <w:p>
       <w:pPr>
         <w:pStyle w:val="Heading3"/>
@@ -3776,8 +4011,8 @@
         </w:tc>
       </w:tr>
     </w:tbl>
-    <w:bookmarkEnd w:id="45"/>
-    <w:bookmarkStart w:id="46" w:name="key-findings"/>
+    <w:bookmarkEnd w:id="39"/>
+    <w:bookmarkStart w:id="40" w:name="key-findings"/>
     <w:p>
       <w:pPr>
         <w:pStyle w:val="Heading3"/>
@@ -3881,9 +4116,9 @@
         <w:t xml:space="preserve">C5 (DPR+Desc) outperforms C4 (DPR+Name) by 5.38 pp on Hit@1 and C6 (DPR+Wiki) by 7.43 pp. The pattern holds for off-the-shelf BGE as well.</w:t>
       </w:r>
     </w:p>
-    <w:bookmarkEnd w:id="46"/>
-    <w:bookmarkEnd w:id="47"/>
-    <w:bookmarkStart w:id="48" w:name="discussion"/>
+    <w:bookmarkEnd w:id="40"/>
+    <w:bookmarkEnd w:id="41"/>
+    <w:bookmarkStart w:id="42" w:name="discussion"/>
     <w:p>
       <w:pPr>
         <w:pStyle w:val="Heading2"/>
@@ -3928,8 +4163,8 @@
         <w:t xml:space="preserve">Benchmark calibration validates the dataset's difficulty: an automated quality assessment (n=500, GPT-4o judge) found 42% of samples recoverable by informed judgment, closely matching the best system's alias accuracy (41.4%), suggesting top models approach the practical ceiling imposed by available cues. EEN naturalness averaged 4.87/5. Limitations include the English-only, American-focused scope; LLM-generated entity elision (though validated); alias-aware evaluation that still penalizes unregistered surface forms; and QLoRA's max_seq=192 tokens truncating approximately 6% of prompts.</w:t>
       </w:r>
     </w:p>
-    <w:bookmarkEnd w:id="48"/>
-    <w:bookmarkStart w:id="49" w:name="conclusion"/>
+    <w:bookmarkEnd w:id="42"/>
+    <w:bookmarkStart w:id="43" w:name="conclusion"/>
     <w:p>
       <w:pPr>
         <w:pStyle w:val="Heading2"/>
@@ -3947,8 +4182,8 @@
         <w:t xml:space="preserve">We have extended implicit entity recognition to long-form reminiscence narratives, formalizing the non-locality property and releasing IRC-Bench with 25,136 samples from 12,337 Wikidata-linked entities across 1,994 oral history transcripts. Our evaluation of 19 configurations reveals that fine-tuning is the most impactful intervention (QLoRA achieving 38.94% exact match, nearly tripling the base model), chain-of-thought prompting consistently degrades performance, and RAG underperforms direct inference due to the non-locality of implicit cues. Future work should explore combining DPR shortlists with LLM reranking (leveraging C5's 71.49% Hit@10), cross-lingual benchmarks, and architectures that explicitly model distributed cue structure.</w:t>
       </w:r>
     </w:p>
-    <w:bookmarkEnd w:id="49"/>
-    <w:bookmarkStart w:id="50" w:name="references"/>
+    <w:bookmarkEnd w:id="43"/>
+    <w:bookmarkStart w:id="44" w:name="references"/>
     <w:p>
       <w:pPr>
         <w:pStyle w:val="Heading2"/>
@@ -4784,7 +5019,7 @@
         <w:t xml:space="preserve">.</w:t>
       </w:r>
     </w:p>
-    <w:bookmarkEnd w:id="50"/>
+    <w:bookmarkEnd w:id="44"/>
     <w:p>
       <w:pPr>
         <w:pStyle w:val="BodyText"/>
@@ -4796,7 +5031,7 @@
       <w:r>
         <w:t xml:space="preserve"> </w:t>
       </w:r>
-      <w:hyperlink r:id="rId51">
+      <w:hyperlink r:id="rId45">
         <w:r>
           <w:rPr>
             <w:rStyle w:val="Hyperlink"/>

</xml_diff>